<commit_message>
Add LinkedIn, Medium posts and Image prompts for All-Star profile
</commit_message>
<xml_diff>
--- a/Project_06_JobAsistant_AI/JobTrackerAI/Prachi_Joshi_Profile 2024.docx
+++ b/Project_06_JobAsistant_AI/JobTrackerAI/Prachi_Joshi_Profile 2024.docx
@@ -1,6 +1,6 @@
 
 <file path=word/document.xml><?xml version="1.0" encoding="utf-8"?>
-<w:document xmlns:wpc="http://schemas.microsoft.com/office/word/2010/wordprocessingCanvas" xmlns:cx="http://schemas.microsoft.com/office/drawing/2014/chartex" xmlns:cx1="http://schemas.microsoft.com/office/drawing/2015/9/8/chartex" xmlns:cx2="http://schemas.microsoft.com/office/drawing/2015/10/21/chartex" xmlns:cx3="http://schemas.microsoft.com/office/drawing/2016/5/9/chartex" xmlns:cx4="http://schemas.microsoft.com/office/drawing/2016/5/10/chartex" xmlns:cx5="http://schemas.microsoft.com/office/drawing/2016/5/11/chartex" xmlns:cx6="http://schemas.microsoft.com/office/drawing/2016/5/12/chartex" xmlns:cx7="http://schemas.microsoft.com/office/drawing/2016/5/13/chartex" xmlns:cx8="http://schemas.microsoft.com/office/drawing/2016/5/14/chartex" xmlns:mc="http://schemas.openxmlformats.org/markup-compatibility/2006" xmlns:aink="http://schemas.microsoft.com/office/drawing/2016/ink" xmlns:am3d="http://schemas.microsoft.com/office/drawing/2017/model3d" xmlns:o="urn:schemas-microsoft-com:office:office" xmlns:oel="http://schemas.microsoft.com/office/2019/extlst" xmlns:r="http://schemas.openxmlformats.org/officeDocument/2006/relationships" xmlns:m="http://schemas.openxmlformats.org/officeDocument/2006/math" xmlns:v="urn:schemas-microsoft-com:vml" xmlns:wp14="http://schemas.microsoft.com/office/word/2010/wordprocessingDrawing" xmlns:wp="http://schemas.openxmlformats.org/drawingml/2006/wordprocessingDrawing" xmlns:w10="urn:schemas-microsoft-com:office:word" xmlns:w="http://schemas.openxmlformats.org/wordprocessingml/2006/main" xmlns:w14="http://schemas.microsoft.com/office/word/2010/wordml" xmlns:w15="http://schemas.microsoft.com/office/word/2012/wordml" xmlns:w16cex="http://schemas.microsoft.com/office/word/2018/wordml/cex" xmlns:w16cid="http://schemas.microsoft.com/office/word/2016/wordml/cid" xmlns:w16="http://schemas.microsoft.com/office/word/2018/wordml" xmlns:w16sdtdh="http://schemas.microsoft.com/office/word/2020/wordml/sdtdatahash" xmlns:w16se="http://schemas.microsoft.com/office/word/2015/wordml/symex" xmlns:wpg="http://schemas.microsoft.com/office/word/2010/wordprocessingGroup" xmlns:wpi="http://schemas.microsoft.com/office/word/2010/wordprocessingInk" xmlns:wne="http://schemas.microsoft.com/office/word/2006/wordml" xmlns:wps="http://schemas.microsoft.com/office/word/2010/wordprocessingShape" mc:Ignorable="w14 w15 w16se w16cid w16 w16cex w16sdtdh wp14">
+<w:document xmlns:wpc="http://schemas.microsoft.com/office/word/2010/wordprocessingCanvas" xmlns:cx="http://schemas.microsoft.com/office/drawing/2014/chartex" xmlns:cx1="http://schemas.microsoft.com/office/drawing/2015/9/8/chartex" xmlns:cx2="http://schemas.microsoft.com/office/drawing/2015/10/21/chartex" xmlns:cx3="http://schemas.microsoft.com/office/drawing/2016/5/9/chartex" xmlns:cx4="http://schemas.microsoft.com/office/drawing/2016/5/10/chartex" xmlns:cx5="http://schemas.microsoft.com/office/drawing/2016/5/11/chartex" xmlns:cx6="http://schemas.microsoft.com/office/drawing/2016/5/12/chartex" xmlns:cx7="http://schemas.microsoft.com/office/drawing/2016/5/13/chartex" xmlns:cx8="http://schemas.microsoft.com/office/drawing/2016/5/14/chartex" xmlns:mc="http://schemas.openxmlformats.org/markup-compatibility/2006" xmlns:aink="http://schemas.microsoft.com/office/drawing/2016/ink" xmlns:am3d="http://schemas.microsoft.com/office/drawing/2017/model3d" xmlns:o="urn:schemas-microsoft-com:office:office" xmlns:oel="http://schemas.microsoft.com/office/2019/extlst" xmlns:r="http://schemas.openxmlformats.org/officeDocument/2006/relationships" xmlns:m="http://schemas.openxmlformats.org/officeDocument/2006/math" xmlns:v="urn:schemas-microsoft-com:vml" xmlns:wp14="http://schemas.microsoft.com/office/word/2010/wordprocessingDrawing" xmlns:wp="http://schemas.openxmlformats.org/drawingml/2006/wordprocessingDrawing" xmlns:w10="urn:schemas-microsoft-com:office:word" xmlns:w="http://schemas.openxmlformats.org/wordprocessingml/2006/main" xmlns:w14="http://schemas.microsoft.com/office/word/2010/wordml" xmlns:w15="http://schemas.microsoft.com/office/word/2012/wordml" xmlns:w16cex="http://schemas.microsoft.com/office/word/2018/wordml/cex" xmlns:w16cid="http://schemas.microsoft.com/office/word/2016/wordml/cid" xmlns:w16="http://schemas.microsoft.com/office/word/2018/wordml" xmlns:w16du="http://schemas.microsoft.com/office/word/2023/wordml/word16du" xmlns:w16sdtdh="http://schemas.microsoft.com/office/word/2020/wordml/sdtdatahash" xmlns:w16sdtfl="http://schemas.microsoft.com/office/word/2024/wordml/sdtformatlock" xmlns:w16se="http://schemas.microsoft.com/office/word/2015/wordml/symex" xmlns:wpg="http://schemas.microsoft.com/office/word/2010/wordprocessingGroup" xmlns:wpi="http://schemas.microsoft.com/office/word/2010/wordprocessingInk" xmlns:wne="http://schemas.microsoft.com/office/word/2006/wordml" xmlns:wps="http://schemas.microsoft.com/office/word/2010/wordprocessingShape" mc:Ignorable="w14 w15 w16se w16cid w16 w16cex w16sdtdh w16sdtfl w16du wp14">
   <w:body>
     <w:p>
       <w:pPr>
@@ -9,7 +9,6 @@
       </w:pPr>
       <w:bookmarkStart w:id="0" w:name="_Hlk92970652"/>
       <w:bookmarkEnd w:id="0"/>
-      <w:proofErr w:type="spellStart"/>
       <w:r>
         <w:rPr>
           <w:rFonts w:ascii="Times New Roman" w:eastAsia="Times New Roman" w:hAnsi="Times New Roman" w:cs="Times New Roman"/>
@@ -17,17 +16,7 @@
           <w:sz w:val="56"/>
           <w:szCs w:val="56"/>
         </w:rPr>
-        <w:t>Prachi</w:t>
-      </w:r>
-      <w:proofErr w:type="spellEnd"/>
-      <w:r>
-        <w:rPr>
-          <w:rFonts w:ascii="Times New Roman" w:eastAsia="Times New Roman" w:hAnsi="Times New Roman" w:cs="Times New Roman"/>
-          <w:b/>
-          <w:sz w:val="56"/>
-          <w:szCs w:val="56"/>
-        </w:rPr>
-        <w:t xml:space="preserve"> Joshi         </w:t>
+        <w:t xml:space="preserve">Prachi Joshi         </w:t>
       </w:r>
       <w:r>
         <w:rPr>
@@ -528,21 +517,7 @@
         <w:rPr>
           <w:rFonts w:ascii="Times New Roman" w:eastAsia="Times New Roman" w:hAnsi="Times New Roman" w:cs="Times New Roman"/>
         </w:rPr>
-        <w:t xml:space="preserve"> container for </w:t>
-      </w:r>
-      <w:proofErr w:type="spellStart"/>
-      <w:r>
-        <w:rPr>
-          <w:rFonts w:ascii="Times New Roman" w:eastAsia="Times New Roman" w:hAnsi="Times New Roman" w:cs="Times New Roman"/>
-        </w:rPr>
-        <w:t>ForgeRock</w:t>
-      </w:r>
-      <w:proofErr w:type="spellEnd"/>
-      <w:r>
-        <w:rPr>
-          <w:rFonts w:ascii="Times New Roman" w:eastAsia="Times New Roman" w:hAnsi="Times New Roman" w:cs="Times New Roman"/>
-        </w:rPr>
-        <w:t xml:space="preserve"> AM instance and Docker JWT signer in PSD2 Project.</w:t>
+        <w:t xml:space="preserve"> container for ForgeRock AM instance and Docker JWT signer in PSD2 Project.</w:t>
       </w:r>
     </w:p>
     <w:p>
@@ -776,23 +751,13 @@
         </w:rPr>
         <w:t xml:space="preserve">Three years of experience with the </w:t>
       </w:r>
-      <w:proofErr w:type="spellStart"/>
       <w:r>
         <w:rPr>
           <w:rFonts w:ascii="Times New Roman" w:eastAsia="Times New Roman" w:hAnsi="Times New Roman" w:cs="Times New Roman"/>
           <w:b/>
           <w:bCs/>
         </w:rPr>
-        <w:t>ForgeRock</w:t>
-      </w:r>
-      <w:proofErr w:type="spellEnd"/>
-      <w:r>
-        <w:rPr>
-          <w:rFonts w:ascii="Times New Roman" w:eastAsia="Times New Roman" w:hAnsi="Times New Roman" w:cs="Times New Roman"/>
-          <w:b/>
-          <w:bCs/>
-        </w:rPr>
-        <w:t xml:space="preserve"> Identity Platform</w:t>
+        <w:t>ForgeRock Identity Platform</w:t>
       </w:r>
       <w:r>
         <w:rPr>
@@ -1097,12 +1062,12 @@
           </mc:Choice>
           <mc:Fallback>
             <w:pict>
-              <v:group w14:anchorId="14FCF616" id="Group 2" o:spid="_x0000_s1026" style="width:450pt;height:32.3pt;mso-position-horizontal-relative:char;mso-position-vertical-relative:line" coordsize="59766,2825" o:gfxdata="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">
-                <v:shape id="Shape 7939" o:spid="_x0000_s1027" style="position:absolute;width:59632;height:1314;visibility:visible;mso-wrap-style:square;v-text-anchor:top" coordsize="5963285,131432" o:gfxdata="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" path="m,l5963285,r,131432l,131432,,e" fillcolor="#d9d9d9" stroked="f" strokeweight="0">
+              <v:group w14:anchorId="14FCF616" id="Group 2" o:spid="_x0000_s1026" style="width:450pt;height:32.3pt;mso-position-horizontal-relative:char;mso-position-vertical-relative:line" coordsize="59766,2825" o:gfxdata="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">
+                <v:shape id="Shape 7939" o:spid="_x0000_s1027" style="position:absolute;width:59632;height:1314;visibility:visible;mso-wrap-style:square;v-text-anchor:top" coordsize="5963285,131432" o:gfxdata="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" path="m,l5963285,r,131432l,131432,,e" fillcolor="#d9d9d9" stroked="f" strokeweight="0">
                   <v:stroke miterlimit="83231f" joinstyle="miter"/>
                   <v:path arrowok="t" textboxrect="0,0,5963285,131432"/>
                 </v:shape>
-                <v:rect id="Rectangle 4" o:spid="_x0000_s1028" style="position:absolute;left:165;top:292;width:16294;height:2070;visibility:visible;mso-wrap-style:square;v-text-anchor:top" o:gfxdata="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" filled="f" stroked="f">
+                <v:rect id="Rectangle 4" o:spid="_x0000_s1028" style="position:absolute;left:165;top:292;width:16294;height:2070;visibility:visible;mso-wrap-style:square;v-text-anchor:top" o:gfxdata="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" filled="f" stroked="f">
                   <v:textbox inset="0,0,0,0">
                     <w:txbxContent>
                       <w:p>
@@ -1121,7 +1086,7 @@
                     </w:txbxContent>
                   </v:textbox>
                 </v:rect>
-                <v:shape id="Shape 7940" o:spid="_x0000_s1029" style="position:absolute;top:1314;width:59766;height:1511;visibility:visible;mso-wrap-style:square;v-text-anchor:top" coordsize="5976621,151143" o:gfxdata="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" path="m,l5976621,r,151143l,151143,,e" stroked="f" strokeweight="0">
+                <v:shape id="Shape 7940" o:spid="_x0000_s1029" style="position:absolute;top:1314;width:59766;height:1511;visibility:visible;mso-wrap-style:square;v-text-anchor:top" coordsize="5976621,151143" o:gfxdata="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" path="m,l5976621,r,151143l,151143,,e" stroked="f" strokeweight="0">
                   <v:stroke miterlimit="83231f" joinstyle="miter"/>
                   <v:path arrowok="t" textboxrect="0,0,5976621,151143"/>
                 </v:shape>
@@ -1445,7 +1410,6 @@
         </w:rPr>
         <w:t> </w:t>
       </w:r>
-      <w:proofErr w:type="spellStart"/>
       <w:r>
         <w:rPr>
           <w:color w:val="000000"/>
@@ -1453,17 +1417,7 @@
           <w:szCs w:val="22"/>
           <w:lang w:val="en-US" w:eastAsia="en-US" w:bidi="en-US"/>
         </w:rPr>
-        <w:t>Gradle</w:t>
-      </w:r>
-      <w:proofErr w:type="spellEnd"/>
-      <w:r>
-        <w:rPr>
-          <w:color w:val="000000"/>
-          <w:sz w:val="18"/>
-          <w:szCs w:val="22"/>
-          <w:lang w:val="en-US" w:eastAsia="en-US" w:bidi="en-US"/>
-        </w:rPr>
-        <w:t>,</w:t>
+        <w:t>Gradle,</w:t>
       </w:r>
       <w:r>
         <w:rPr>
@@ -1770,12 +1724,12 @@
           </mc:Choice>
           <mc:Fallback>
             <w:pict>
-              <v:group w14:anchorId="1A422562" id="Group 7458" o:spid="_x0000_s1030" style="width:450pt;height:29.75pt;mso-position-horizontal-relative:char;mso-position-vertical-relative:line" coordsize="59766,2825" o:gfxdata="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">
-                <v:shape id="Shape 7939" o:spid="_x0000_s1031" style="position:absolute;width:59632;height:1314;visibility:visible;mso-wrap-style:square;v-text-anchor:top" coordsize="5963285,131432" o:gfxdata="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" path="m,l5963285,r,131432l,131432,,e" fillcolor="#d9d9d9" stroked="f" strokeweight="0">
+              <v:group w14:anchorId="1A422562" id="Group 7458" o:spid="_x0000_s1030" style="width:450pt;height:29.75pt;mso-position-horizontal-relative:char;mso-position-vertical-relative:line" coordsize="59766,2825" o:gfxdata="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">
+                <v:shape id="Shape 7939" o:spid="_x0000_s1031" style="position:absolute;width:59632;height:1314;visibility:visible;mso-wrap-style:square;v-text-anchor:top" coordsize="5963285,131432" o:gfxdata="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" path="m,l5963285,r,131432l,131432,,e" fillcolor="#d9d9d9" stroked="f" strokeweight="0">
                   <v:stroke miterlimit="83231f" joinstyle="miter"/>
                   <v:path arrowok="t" textboxrect="0,0,5963285,131432"/>
                 </v:shape>
-                <v:rect id="Rectangle 156" o:spid="_x0000_s1032" style="position:absolute;left:165;top:292;width:16294;height:2070;visibility:visible;mso-wrap-style:square;v-text-anchor:top" o:gfxdata="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" filled="f" stroked="f">
+                <v:rect id="Rectangle 156" o:spid="_x0000_s1032" style="position:absolute;left:165;top:292;width:16294;height:2070;visibility:visible;mso-wrap-style:square;v-text-anchor:top" o:gfxdata="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" filled="f" stroked="f">
                   <v:textbox inset="0,0,0,0">
                     <w:txbxContent>
                       <w:p>
@@ -1804,7 +1758,7 @@
                     </w:txbxContent>
                   </v:textbox>
                 </v:rect>
-                <v:shape id="Shape 7940" o:spid="_x0000_s1033" style="position:absolute;top:1314;width:59766;height:1511;visibility:visible;mso-wrap-style:square;v-text-anchor:top" coordsize="5976621,151143" o:gfxdata="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" path="m,l5976621,r,151143l,151143,,e" stroked="f" strokeweight="0">
+                <v:shape id="Shape 7940" o:spid="_x0000_s1033" style="position:absolute;top:1314;width:59766;height:1511;visibility:visible;mso-wrap-style:square;v-text-anchor:top" coordsize="5976621,151143" o:gfxdata="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" path="m,l5976621,r,151143l,151143,,e" stroked="f" strokeweight="0">
                   <v:stroke miterlimit="83231f" joinstyle="miter"/>
                   <v:path arrowok="t" textboxrect="0,0,5976621,151143"/>
                 </v:shape>
@@ -2374,7 +2328,7 @@
               <w:rPr>
                 <w:rFonts w:ascii="Times New Roman" w:eastAsia="Times New Roman" w:hAnsi="Times New Roman" w:cs="Times New Roman"/>
               </w:rPr>
-              <w:t>Mortgages</w:t>
+              <w:t xml:space="preserve">Savings </w:t>
             </w:r>
           </w:p>
         </w:tc>
@@ -2400,13 +2354,7 @@
               <w:rPr>
                 <w:rFonts w:ascii="Times New Roman" w:eastAsia="Times New Roman" w:hAnsi="Times New Roman" w:cs="Times New Roman"/>
               </w:rPr>
-              <w:t>01 Sept 2023</w:t>
-            </w:r>
-            <w:r>
-              <w:rPr>
-                <w:rFonts w:ascii="Times New Roman" w:eastAsia="Times New Roman" w:hAnsi="Times New Roman" w:cs="Times New Roman"/>
-              </w:rPr>
-              <w:t xml:space="preserve"> till now</w:t>
+              <w:t>June 2025 – till now</w:t>
             </w:r>
           </w:p>
         </w:tc>
@@ -2429,19 +2377,263 @@
                 <w:b/>
               </w:rPr>
             </w:pPr>
+            <w:r>
+              <w:rPr>
+                <w:b/>
+              </w:rPr>
+              <w:t xml:space="preserve">Mobile app Biometric enrolments third party tools </w:t>
+            </w:r>
+            <w:proofErr w:type="gramStart"/>
+            <w:r>
+              <w:rPr>
+                <w:b/>
+              </w:rPr>
+              <w:t>validations ,</w:t>
+            </w:r>
+            <w:proofErr w:type="gramEnd"/>
+            <w:r>
+              <w:rPr>
+                <w:b/>
+              </w:rPr>
+              <w:t xml:space="preserve"> Appium Mobile app Automation</w:t>
+            </w:r>
+            <w:proofErr w:type="gramStart"/>
+            <w:r>
+              <w:rPr>
+                <w:b/>
+              </w:rPr>
+              <w:t>, ,</w:t>
+            </w:r>
+            <w:proofErr w:type="gramEnd"/>
+            <w:r>
+              <w:rPr>
+                <w:b/>
+              </w:rPr>
+              <w:t xml:space="preserve"> Karate API </w:t>
+            </w:r>
             <w:proofErr w:type="spellStart"/>
             <w:r>
               <w:rPr>
                 <w:b/>
               </w:rPr>
-              <w:t>TestNG</w:t>
+              <w:t>framwrok</w:t>
             </w:r>
             <w:proofErr w:type="spellEnd"/>
             <w:r>
               <w:rPr>
                 <w:b/>
               </w:rPr>
-              <w:t xml:space="preserve"> framework ,Selenium, UI and API Automation , Ready API tool , Java, Postman, Cucumber framework , GitHub , CICD Pipeline, </w:t>
+              <w:t xml:space="preserve"> Vibe coding created a Dashboard testing status integrated JIRA and confluence </w:t>
+            </w:r>
+          </w:p>
+        </w:tc>
+      </w:tr>
+      <w:tr>
+        <w:trPr>
+          <w:trHeight w:val="747"/>
+        </w:trPr>
+        <w:tc>
+          <w:tcPr>
+            <w:tcW w:w="0" w:type="auto"/>
+            <w:vMerge/>
+            <w:tcBorders>
+              <w:top w:val="nil"/>
+              <w:left w:val="nil"/>
+              <w:bottom w:val="nil"/>
+              <w:right w:val="single" w:sz="8" w:space="0" w:color="808080"/>
+            </w:tcBorders>
+          </w:tcPr>
+          <w:p>
+            <w:pPr>
+              <w:spacing w:after="160" w:line="259" w:lineRule="auto"/>
+              <w:ind w:left="0" w:firstLine="0"/>
+            </w:pPr>
+          </w:p>
+        </w:tc>
+        <w:tc>
+          <w:tcPr>
+            <w:tcW w:w="1212" w:type="dxa"/>
+            <w:tcBorders>
+              <w:top w:val="single" w:sz="18" w:space="0" w:color="808080"/>
+              <w:left w:val="single" w:sz="8" w:space="0" w:color="808080"/>
+              <w:bottom w:val="single" w:sz="8" w:space="0" w:color="808080"/>
+              <w:right w:val="single" w:sz="8" w:space="0" w:color="808080"/>
+            </w:tcBorders>
+          </w:tcPr>
+          <w:p>
+            <w:pPr>
+              <w:spacing w:after="0" w:line="259" w:lineRule="auto"/>
+              <w:ind w:left="82" w:firstLine="0"/>
+              <w:rPr>
+                <w:rFonts w:ascii="Times New Roman" w:eastAsia="Times New Roman" w:hAnsi="Times New Roman" w:cs="Times New Roman"/>
+              </w:rPr>
+            </w:pPr>
+            <w:r>
+              <w:rPr>
+                <w:rFonts w:ascii="Times New Roman" w:eastAsia="Times New Roman" w:hAnsi="Times New Roman" w:cs="Times New Roman"/>
+              </w:rPr>
+              <w:t>1</w:t>
+            </w:r>
+          </w:p>
+        </w:tc>
+        <w:tc>
+          <w:tcPr>
+            <w:tcW w:w="2093" w:type="dxa"/>
+            <w:tcBorders>
+              <w:top w:val="single" w:sz="18" w:space="0" w:color="808080"/>
+              <w:left w:val="single" w:sz="8" w:space="0" w:color="808080"/>
+              <w:bottom w:val="single" w:sz="8" w:space="0" w:color="808080"/>
+              <w:right w:val="single" w:sz="8" w:space="0" w:color="808080"/>
+            </w:tcBorders>
+          </w:tcPr>
+          <w:p>
+            <w:pPr>
+              <w:spacing w:after="0" w:line="259" w:lineRule="auto"/>
+              <w:ind w:left="82" w:firstLine="0"/>
+              <w:rPr>
+                <w:rFonts w:ascii="Times New Roman" w:eastAsia="Times New Roman" w:hAnsi="Times New Roman" w:cs="Times New Roman"/>
+              </w:rPr>
+            </w:pPr>
+            <w:r>
+              <w:rPr>
+                <w:rFonts w:ascii="Times New Roman" w:eastAsia="Times New Roman" w:hAnsi="Times New Roman" w:cs="Times New Roman"/>
+              </w:rPr>
+              <w:t>Mortgages</w:t>
+            </w:r>
+          </w:p>
+        </w:tc>
+        <w:tc>
+          <w:tcPr>
+            <w:tcW w:w="1808" w:type="dxa"/>
+            <w:tcBorders>
+              <w:top w:val="single" w:sz="18" w:space="0" w:color="808080"/>
+              <w:left w:val="single" w:sz="8" w:space="0" w:color="808080"/>
+              <w:bottom w:val="single" w:sz="8" w:space="0" w:color="808080"/>
+              <w:right w:val="single" w:sz="8" w:space="0" w:color="808080"/>
+            </w:tcBorders>
+          </w:tcPr>
+          <w:p>
+            <w:pPr>
+              <w:spacing w:after="0" w:line="259" w:lineRule="auto"/>
+              <w:ind w:left="82" w:firstLine="0"/>
+              <w:rPr>
+                <w:rFonts w:ascii="Times New Roman" w:eastAsia="Times New Roman" w:hAnsi="Times New Roman" w:cs="Times New Roman"/>
+              </w:rPr>
+            </w:pPr>
+            <w:r>
+              <w:rPr>
+                <w:rFonts w:ascii="Times New Roman" w:eastAsia="Times New Roman" w:hAnsi="Times New Roman" w:cs="Times New Roman"/>
+              </w:rPr>
+              <w:t>01 Sept 2023</w:t>
+            </w:r>
+            <w:r>
+              <w:rPr>
+                <w:rFonts w:ascii="Times New Roman" w:eastAsia="Times New Roman" w:hAnsi="Times New Roman" w:cs="Times New Roman"/>
+              </w:rPr>
+              <w:t xml:space="preserve"> </w:t>
+            </w:r>
+            <w:r>
+              <w:rPr>
+                <w:rFonts w:ascii="Times New Roman" w:eastAsia="Times New Roman" w:hAnsi="Times New Roman" w:cs="Times New Roman"/>
+              </w:rPr>
+              <w:t>– 20 June 2025</w:t>
+            </w:r>
+          </w:p>
+        </w:tc>
+        <w:tc>
+          <w:tcPr>
+            <w:tcW w:w="3923" w:type="dxa"/>
+            <w:gridSpan w:val="2"/>
+            <w:tcBorders>
+              <w:top w:val="single" w:sz="18" w:space="0" w:color="808080"/>
+              <w:left w:val="single" w:sz="8" w:space="0" w:color="808080"/>
+              <w:bottom w:val="single" w:sz="8" w:space="0" w:color="808080"/>
+              <w:right w:val="single" w:sz="8" w:space="0" w:color="808080"/>
+            </w:tcBorders>
+          </w:tcPr>
+          <w:p>
+            <w:pPr>
+              <w:spacing w:after="15" w:line="259" w:lineRule="auto"/>
+              <w:ind w:left="82" w:firstLine="0"/>
+              <w:rPr>
+                <w:b/>
+              </w:rPr>
+            </w:pPr>
+            <w:r>
+              <w:rPr>
+                <w:b/>
+              </w:rPr>
+              <w:t xml:space="preserve">TestNG </w:t>
+            </w:r>
+            <w:proofErr w:type="gramStart"/>
+            <w:r>
+              <w:rPr>
+                <w:b/>
+              </w:rPr>
+              <w:t>framework ,Selenium</w:t>
+            </w:r>
+            <w:proofErr w:type="gramEnd"/>
+            <w:r>
+              <w:rPr>
+                <w:b/>
+              </w:rPr>
+              <w:t xml:space="preserve">, UI and API </w:t>
+            </w:r>
+            <w:proofErr w:type="gramStart"/>
+            <w:r>
+              <w:rPr>
+                <w:b/>
+              </w:rPr>
+              <w:t>Automation ,</w:t>
+            </w:r>
+            <w:proofErr w:type="gramEnd"/>
+            <w:r>
+              <w:rPr>
+                <w:b/>
+              </w:rPr>
+              <w:t xml:space="preserve"> Ready API </w:t>
+            </w:r>
+            <w:proofErr w:type="gramStart"/>
+            <w:r>
+              <w:rPr>
+                <w:b/>
+              </w:rPr>
+              <w:t>tool ,</w:t>
+            </w:r>
+            <w:proofErr w:type="gramEnd"/>
+            <w:r>
+              <w:rPr>
+                <w:b/>
+              </w:rPr>
+              <w:t xml:space="preserve"> Java, Postman, Cucumber </w:t>
+            </w:r>
+            <w:proofErr w:type="gramStart"/>
+            <w:r>
+              <w:rPr>
+                <w:b/>
+              </w:rPr>
+              <w:t>framework ,</w:t>
+            </w:r>
+            <w:proofErr w:type="gramEnd"/>
+            <w:r>
+              <w:rPr>
+                <w:b/>
+              </w:rPr>
+              <w:t xml:space="preserve"> </w:t>
+            </w:r>
+            <w:proofErr w:type="gramStart"/>
+            <w:r>
+              <w:rPr>
+                <w:b/>
+              </w:rPr>
+              <w:t>GitHub ,</w:t>
+            </w:r>
+            <w:proofErr w:type="gramEnd"/>
+            <w:r>
+              <w:rPr>
+                <w:b/>
+              </w:rPr>
+              <w:t xml:space="preserve"> CICD Pipeline, </w:t>
             </w:r>
             <w:proofErr w:type="spellStart"/>
             <w:r>
@@ -2876,197 +3068,167 @@
                 <w:bCs/>
               </w:rPr>
             </w:pPr>
-            <w:proofErr w:type="spellStart"/>
             <w:r>
               <w:rPr>
                 <w:bCs/>
               </w:rPr>
-              <w:t>ForgeRock</w:t>
-            </w:r>
-            <w:proofErr w:type="spellEnd"/>
+              <w:t xml:space="preserve">ForgeRock Platform </w:t>
+            </w:r>
             <w:r>
               <w:rPr>
                 <w:bCs/>
               </w:rPr>
-              <w:t xml:space="preserve"> Platform </w:t>
+              <w:t>(</w:t>
             </w:r>
             <w:r>
               <w:rPr>
                 <w:bCs/>
               </w:rPr>
-              <w:t>(</w:t>
+              <w:t>AM,</w:t>
             </w:r>
             <w:r>
               <w:rPr>
                 <w:bCs/>
               </w:rPr>
-              <w:t>AM,</w:t>
+              <w:t xml:space="preserve"> </w:t>
             </w:r>
             <w:r>
               <w:rPr>
                 <w:bCs/>
               </w:rPr>
+              <w:t>IDM,</w:t>
+            </w:r>
+            <w:r>
+              <w:rPr>
+                <w:bCs/>
+              </w:rPr>
+              <w:t xml:space="preserve"> IG</w:t>
+            </w:r>
+            <w:r>
+              <w:rPr>
+                <w:bCs/>
+              </w:rPr>
+              <w:t>),</w:t>
+            </w:r>
+            <w:r>
+              <w:rPr>
+                <w:bCs/>
+              </w:rPr>
               <w:t xml:space="preserve"> </w:t>
             </w:r>
             <w:r>
               <w:rPr>
                 <w:bCs/>
               </w:rPr>
-              <w:t>IDM,</w:t>
+              <w:t>Postman,</w:t>
             </w:r>
             <w:r>
               <w:rPr>
                 <w:bCs/>
               </w:rPr>
-              <w:t xml:space="preserve"> IG</w:t>
+              <w:t xml:space="preserve"> </w:t>
             </w:r>
             <w:r>
               <w:rPr>
                 <w:bCs/>
               </w:rPr>
-              <w:t>),</w:t>
+              <w:t xml:space="preserve">SQL </w:t>
             </w:r>
             <w:r>
               <w:rPr>
                 <w:bCs/>
               </w:rPr>
-              <w:t xml:space="preserve"> </w:t>
+              <w:t>developer,</w:t>
             </w:r>
             <w:r>
               <w:rPr>
                 <w:bCs/>
               </w:rPr>
-              <w:t>Postman,</w:t>
+              <w:t xml:space="preserve"> Web </w:t>
             </w:r>
             <w:r>
               <w:rPr>
                 <w:bCs/>
               </w:rPr>
-              <w:t xml:space="preserve"> </w:t>
+              <w:t>Testing</w:t>
             </w:r>
             <w:r>
               <w:rPr>
                 <w:bCs/>
               </w:rPr>
-              <w:t xml:space="preserve">SQL </w:t>
+              <w:t>, Rest API</w:t>
             </w:r>
             <w:r>
               <w:rPr>
                 <w:bCs/>
               </w:rPr>
-              <w:t>developer,</w:t>
+              <w:t xml:space="preserve">s, Selenium </w:t>
             </w:r>
             <w:r>
               <w:rPr>
                 <w:bCs/>
               </w:rPr>
-              <w:t xml:space="preserve"> Web </w:t>
+              <w:t>Java,</w:t>
             </w:r>
             <w:r>
               <w:rPr>
                 <w:bCs/>
               </w:rPr>
-              <w:t>Testing</w:t>
+              <w:t xml:space="preserve"> Rest Assured, Karate </w:t>
             </w:r>
             <w:r>
               <w:rPr>
                 <w:bCs/>
               </w:rPr>
-              <w:t>, Rest API</w:t>
+              <w:t xml:space="preserve">API Automation </w:t>
             </w:r>
             <w:r>
               <w:rPr>
                 <w:bCs/>
               </w:rPr>
-              <w:t xml:space="preserve">s, Selenium </w:t>
+              <w:t>Framework, JIRA Xray</w:t>
             </w:r>
             <w:r>
               <w:rPr>
                 <w:bCs/>
               </w:rPr>
-              <w:t>Java,</w:t>
+              <w:t xml:space="preserve">, Broker </w:t>
             </w:r>
             <w:r>
               <w:rPr>
                 <w:bCs/>
               </w:rPr>
-              <w:t xml:space="preserve"> Rest Assured, Karate </w:t>
+              <w:t>Focus (</w:t>
             </w:r>
             <w:r>
               <w:rPr>
                 <w:bCs/>
               </w:rPr>
-              <w:t xml:space="preserve">API Automation </w:t>
+              <w:t xml:space="preserve">client DB) , </w:t>
             </w:r>
             <w:r>
               <w:rPr>
                 <w:bCs/>
               </w:rPr>
-              <w:t xml:space="preserve">Framework, JIRA </w:t>
-            </w:r>
-            <w:proofErr w:type="spellStart"/>
+              <w:t>Spider mail</w:t>
+            </w:r>
             <w:r>
               <w:rPr>
                 <w:bCs/>
               </w:rPr>
-              <w:t>Xray</w:t>
-            </w:r>
-            <w:proofErr w:type="spellEnd"/>
+              <w:t xml:space="preserve"> DB , </w:t>
+            </w:r>
             <w:r>
               <w:rPr>
                 <w:bCs/>
               </w:rPr>
-              <w:t xml:space="preserve">, Broker </w:t>
+              <w:t>AUTH engine</w:t>
             </w:r>
             <w:r>
               <w:rPr>
                 <w:bCs/>
               </w:rPr>
-              <w:t>Focus (</w:t>
-            </w:r>
-            <w:r>
-              <w:rPr>
-                <w:bCs/>
-              </w:rPr>
-              <w:t xml:space="preserve">client DB) , </w:t>
-            </w:r>
-            <w:r>
-              <w:rPr>
-                <w:bCs/>
-              </w:rPr>
-              <w:t>Spider mail</w:t>
-            </w:r>
-            <w:r>
-              <w:rPr>
-                <w:bCs/>
-              </w:rPr>
-              <w:t xml:space="preserve"> DB , </w:t>
-            </w:r>
-            <w:r>
-              <w:rPr>
-                <w:bCs/>
-              </w:rPr>
-              <w:t>AUTH engine</w:t>
-            </w:r>
-            <w:r>
-              <w:rPr>
-                <w:bCs/>
-              </w:rPr>
-              <w:t xml:space="preserve"> , </w:t>
-            </w:r>
-            <w:proofErr w:type="spellStart"/>
-            <w:r>
-              <w:rPr>
-                <w:bCs/>
-              </w:rPr>
-              <w:t>Twilio</w:t>
-            </w:r>
-            <w:proofErr w:type="spellEnd"/>
-            <w:r>
-              <w:rPr>
-                <w:bCs/>
-              </w:rPr>
-              <w:t xml:space="preserve"> as SMS provider</w:t>
+              <w:t xml:space="preserve"> , Twilio as SMS provider</w:t>
             </w:r>
             <w:r>
               <w:rPr>
@@ -3986,7 +4148,6 @@
           <w:rFonts w:ascii="Times New Roman" w:eastAsia="Times New Roman" w:hAnsi="Times New Roman" w:cs="Times New Roman"/>
           <w:b/>
         </w:rPr>
-        <w:lastRenderedPageBreak/>
         <w:t>Designation: Senior Test Automation Analyst</w:t>
       </w:r>
     </w:p>
@@ -4242,15 +4403,7 @@
         <w:t>Description:</w:t>
       </w:r>
       <w:r>
-        <w:t xml:space="preserve"> Experienced IT Professional in financial sector project management and automation. Led initiatives to streamline ISA Share payments and automated Spider mail (Uniface) using TOSCA. Managed team automating Broker Focus with TOSCA, integrating Selenium Java scripts in </w:t>
-      </w:r>
-      <w:proofErr w:type="spellStart"/>
-      <w:r>
-        <w:t>Gitlab</w:t>
-      </w:r>
-      <w:proofErr w:type="spellEnd"/>
-      <w:r>
-        <w:t xml:space="preserve"> CI/CD for improved efficiency. </w:t>
+        <w:t xml:space="preserve"> Experienced IT Professional in financial sector project management and automation. Led initiatives to streamline ISA Share payments and automated Spider mail (Uniface) using TOSCA. Managed team automating Broker Focus with TOSCA, integrating Selenium Java scripts in Gitlab CI/CD for improved efficiency. </w:t>
       </w:r>
     </w:p>
     <w:p>
@@ -4635,7 +4788,6 @@
           <w:rFonts w:ascii="Times New Roman" w:eastAsia="Times New Roman" w:hAnsi="Times New Roman" w:cs="Times New Roman"/>
           <w:b/>
         </w:rPr>
-        <w:lastRenderedPageBreak/>
         <w:t xml:space="preserve">Project </w:t>
       </w:r>
       <w:r>
@@ -4682,20 +4834,39 @@
         </w:rPr>
         <w:t xml:space="preserve"> </w:t>
       </w:r>
-      <w:proofErr w:type="spellStart"/>
       <w:r>
         <w:rPr>
           <w:rFonts w:ascii="Times New Roman" w:eastAsia="Times New Roman" w:hAnsi="Times New Roman" w:cs="Times New Roman"/>
           <w:bCs/>
         </w:rPr>
-        <w:t>ForgeRock</w:t>
-      </w:r>
-      <w:proofErr w:type="spellEnd"/>
+        <w:t xml:space="preserve">ForgeRock </w:t>
+      </w:r>
       <w:r>
         <w:rPr>
           <w:rFonts w:ascii="Times New Roman" w:eastAsia="Times New Roman" w:hAnsi="Times New Roman" w:cs="Times New Roman"/>
           <w:bCs/>
         </w:rPr>
+        <w:t>Platform,</w:t>
+      </w:r>
+      <w:r>
+        <w:rPr>
+          <w:rFonts w:ascii="Times New Roman" w:eastAsia="Times New Roman" w:hAnsi="Times New Roman" w:cs="Times New Roman"/>
+          <w:bCs/>
+        </w:rPr>
+        <w:t xml:space="preserve"> Twilio </w:t>
+      </w:r>
+      <w:r>
+        <w:rPr>
+          <w:rFonts w:ascii="Times New Roman" w:eastAsia="Times New Roman" w:hAnsi="Times New Roman" w:cs="Times New Roman"/>
+          <w:bCs/>
+        </w:rPr>
+        <w:t>SMS</w:t>
+      </w:r>
+      <w:r>
+        <w:rPr>
+          <w:rFonts w:ascii="Times New Roman" w:eastAsia="Times New Roman" w:hAnsi="Times New Roman" w:cs="Times New Roman"/>
+          <w:bCs/>
+        </w:rPr>
         <w:t xml:space="preserve"> </w:t>
       </w:r>
       <w:r>
@@ -4703,7 +4874,7 @@
           <w:rFonts w:ascii="Times New Roman" w:eastAsia="Times New Roman" w:hAnsi="Times New Roman" w:cs="Times New Roman"/>
           <w:bCs/>
         </w:rPr>
-        <w:t>Platform,</w:t>
+        <w:t>provider,</w:t>
       </w:r>
       <w:r>
         <w:rPr>
@@ -4712,15 +4883,13 @@
         </w:rPr>
         <w:t xml:space="preserve"> </w:t>
       </w:r>
-      <w:proofErr w:type="spellStart"/>
       <w:r>
         <w:rPr>
           <w:rFonts w:ascii="Times New Roman" w:eastAsia="Times New Roman" w:hAnsi="Times New Roman" w:cs="Times New Roman"/>
           <w:bCs/>
         </w:rPr>
-        <w:t>Twilio</w:t>
-      </w:r>
-      <w:proofErr w:type="spellEnd"/>
+        <w:t>Docker,</w:t>
+      </w:r>
       <w:r>
         <w:rPr>
           <w:rFonts w:ascii="Times New Roman" w:eastAsia="Times New Roman" w:hAnsi="Times New Roman" w:cs="Times New Roman"/>
@@ -4733,95 +4902,35 @@
           <w:rFonts w:ascii="Times New Roman" w:eastAsia="Times New Roman" w:hAnsi="Times New Roman" w:cs="Times New Roman"/>
           <w:bCs/>
         </w:rPr>
-        <w:t>SMS</w:t>
+        <w:t xml:space="preserve">Selenium , </w:t>
       </w:r>
       <w:r>
         <w:rPr>
           <w:rFonts w:ascii="Times New Roman" w:eastAsia="Times New Roman" w:hAnsi="Times New Roman" w:cs="Times New Roman"/>
           <w:bCs/>
         </w:rPr>
-        <w:t xml:space="preserve"> </w:t>
+        <w:t>Bitbucket</w:t>
       </w:r>
       <w:r>
         <w:rPr>
           <w:rFonts w:ascii="Times New Roman" w:eastAsia="Times New Roman" w:hAnsi="Times New Roman" w:cs="Times New Roman"/>
           <w:bCs/>
         </w:rPr>
-        <w:t>provider,</w:t>
+        <w:t xml:space="preserve">, </w:t>
       </w:r>
       <w:r>
         <w:rPr>
           <w:rFonts w:ascii="Times New Roman" w:eastAsia="Times New Roman" w:hAnsi="Times New Roman" w:cs="Times New Roman"/>
           <w:bCs/>
         </w:rPr>
-        <w:t xml:space="preserve"> </w:t>
+        <w:t>IntelliJ</w:t>
       </w:r>
       <w:r>
         <w:rPr>
           <w:rFonts w:ascii="Times New Roman" w:eastAsia="Times New Roman" w:hAnsi="Times New Roman" w:cs="Times New Roman"/>
           <w:bCs/>
         </w:rPr>
-        <w:t>Docker,</w:t>
-      </w:r>
-      <w:r>
-        <w:rPr>
-          <w:rFonts w:ascii="Times New Roman" w:eastAsia="Times New Roman" w:hAnsi="Times New Roman" w:cs="Times New Roman"/>
-          <w:bCs/>
-        </w:rPr>
-        <w:t xml:space="preserve"> </w:t>
-      </w:r>
-      <w:r>
-        <w:rPr>
-          <w:rFonts w:ascii="Times New Roman" w:eastAsia="Times New Roman" w:hAnsi="Times New Roman" w:cs="Times New Roman"/>
-          <w:bCs/>
-        </w:rPr>
-        <w:t xml:space="preserve">Selenium , </w:t>
-      </w:r>
-      <w:proofErr w:type="spellStart"/>
-      <w:r>
-        <w:rPr>
-          <w:rFonts w:ascii="Times New Roman" w:eastAsia="Times New Roman" w:hAnsi="Times New Roman" w:cs="Times New Roman"/>
-          <w:bCs/>
-        </w:rPr>
-        <w:t>Bitbucket</w:t>
-      </w:r>
-      <w:proofErr w:type="spellEnd"/>
-      <w:r>
-        <w:rPr>
-          <w:rFonts w:ascii="Times New Roman" w:eastAsia="Times New Roman" w:hAnsi="Times New Roman" w:cs="Times New Roman"/>
-          <w:bCs/>
-        </w:rPr>
-        <w:t xml:space="preserve">, </w:t>
-      </w:r>
-      <w:r>
-        <w:rPr>
-          <w:rFonts w:ascii="Times New Roman" w:eastAsia="Times New Roman" w:hAnsi="Times New Roman" w:cs="Times New Roman"/>
-          <w:bCs/>
-        </w:rPr>
-        <w:t>IntelliJ</w:t>
-      </w:r>
-      <w:r>
-        <w:rPr>
-          <w:rFonts w:ascii="Times New Roman" w:eastAsia="Times New Roman" w:hAnsi="Times New Roman" w:cs="Times New Roman"/>
-          <w:bCs/>
-        </w:rPr>
-        <w:t xml:space="preserve">, </w:t>
-      </w:r>
-      <w:proofErr w:type="spellStart"/>
-      <w:r>
-        <w:rPr>
-          <w:rFonts w:ascii="Times New Roman" w:eastAsia="Times New Roman" w:hAnsi="Times New Roman" w:cs="Times New Roman"/>
-          <w:bCs/>
-        </w:rPr>
-        <w:t>Gradle</w:t>
-      </w:r>
-      <w:proofErr w:type="spellEnd"/>
-      <w:r>
-        <w:rPr>
-          <w:rFonts w:ascii="Times New Roman" w:eastAsia="Times New Roman" w:hAnsi="Times New Roman" w:cs="Times New Roman"/>
-          <w:bCs/>
-        </w:rPr>
-        <w:t xml:space="preserve"> ,</w:t>
+        <w:t>, Gradle ,</w:t>
       </w:r>
       <w:r>
         <w:rPr>
@@ -5123,85 +5232,44 @@
           <w:lang w:val="en-GB"/>
         </w:rPr>
       </w:pPr>
-      <w:proofErr w:type="spellStart"/>
       <w:r>
         <w:rPr>
           <w:rFonts w:eastAsia="Times New Roman"/>
           <w:lang w:val="en-GB"/>
         </w:rPr>
-        <w:t>ForgeRock</w:t>
-      </w:r>
-      <w:proofErr w:type="spellEnd"/>
-      <w:r>
+        <w:t>ForgeRock orchestrates the authentication process for granting TPP access.</w:t>
+      </w:r>
+    </w:p>
+    <w:p>
+      <w:pPr>
+        <w:ind w:left="10"/>
         <w:rPr>
           <w:rFonts w:eastAsia="Times New Roman"/>
           <w:lang w:val="en-GB"/>
         </w:rPr>
-        <w:t xml:space="preserve"> orchestrates the authentication process for granting TPP access.</w:t>
-      </w:r>
-    </w:p>
-    <w:p>
-      <w:pPr>
-        <w:ind w:left="10"/>
+      </w:pPr>
+      <w:r>
         <w:rPr>
           <w:rFonts w:eastAsia="Times New Roman"/>
           <w:lang w:val="en-GB"/>
         </w:rPr>
-      </w:pPr>
-      <w:r>
+        <w:t>Authentication logic, including credential verification, is managed by the AUTH engine.</w:t>
+      </w:r>
+    </w:p>
+    <w:p>
+      <w:pPr>
+        <w:ind w:left="10"/>
         <w:rPr>
           <w:rFonts w:eastAsia="Times New Roman"/>
           <w:lang w:val="en-GB"/>
         </w:rPr>
-        <w:t>Authentication logic, including credential verification, is managed by the AUTH engine.</w:t>
-      </w:r>
-    </w:p>
-    <w:p>
-      <w:pPr>
-        <w:ind w:left="10"/>
+      </w:pPr>
+      <w:r>
         <w:rPr>
           <w:rFonts w:eastAsia="Times New Roman"/>
           <w:lang w:val="en-GB"/>
         </w:rPr>
-      </w:pPr>
-      <w:r>
-        <w:rPr>
-          <w:rFonts w:eastAsia="Times New Roman"/>
-          <w:lang w:val="en-GB"/>
-        </w:rPr>
-        <w:t xml:space="preserve">Clients accessing Savings and Currency accounts undergo 2FA via SMS verification, managed through </w:t>
-      </w:r>
-      <w:proofErr w:type="spellStart"/>
-      <w:r>
-        <w:rPr>
-          <w:rFonts w:eastAsia="Times New Roman"/>
-          <w:lang w:val="en-GB"/>
-        </w:rPr>
-        <w:t>Twilio</w:t>
-      </w:r>
-      <w:proofErr w:type="spellEnd"/>
-      <w:r>
-        <w:rPr>
-          <w:rFonts w:eastAsia="Times New Roman"/>
-          <w:lang w:val="en-GB"/>
-        </w:rPr>
-        <w:t xml:space="preserve"> by </w:t>
-      </w:r>
-      <w:proofErr w:type="spellStart"/>
-      <w:r>
-        <w:rPr>
-          <w:rFonts w:eastAsia="Times New Roman"/>
-          <w:lang w:val="en-GB"/>
-        </w:rPr>
-        <w:t>ForgeRock</w:t>
-      </w:r>
-      <w:proofErr w:type="spellEnd"/>
-      <w:r>
-        <w:rPr>
-          <w:rFonts w:eastAsia="Times New Roman"/>
-          <w:lang w:val="en-GB"/>
-        </w:rPr>
-        <w:t>.</w:t>
+        <w:t>Clients accessing Savings and Currency accounts undergo 2FA via SMS verification, managed through Twilio by ForgeRock.</w:t>
       </w:r>
     </w:p>
     <w:p>
@@ -5308,23 +5376,7 @@
           <w:rFonts w:eastAsia="Times New Roman"/>
           <w:lang w:val="en-GB"/>
         </w:rPr>
-        <w:t xml:space="preserve">Implemented Docker for </w:t>
-      </w:r>
-      <w:proofErr w:type="spellStart"/>
-      <w:r>
-        <w:rPr>
-          <w:rFonts w:eastAsia="Times New Roman"/>
-          <w:lang w:val="en-GB"/>
-        </w:rPr>
-        <w:t>ForgeRock</w:t>
-      </w:r>
-      <w:proofErr w:type="spellEnd"/>
-      <w:r>
-        <w:rPr>
-          <w:rFonts w:eastAsia="Times New Roman"/>
-          <w:lang w:val="en-GB"/>
-        </w:rPr>
-        <w:t xml:space="preserve"> AM and IDM components, including creating Docker images for Java JWT signer to enhance automation suite capabilities.</w:t>
+        <w:t>Implemented Docker for ForgeRock AM and IDM components, including creating Docker images for Java JWT signer to enhance automation suite capabilities.</w:t>
       </w:r>
     </w:p>
     <w:p>
@@ -5504,6 +5556,7 @@
           <w:rFonts w:eastAsia="Times New Roman"/>
           <w:lang w:val="en-GB"/>
         </w:rPr>
+        <w:lastRenderedPageBreak/>
         <w:t>Implement new testing techniques and processes within the organization.</w:t>
       </w:r>
     </w:p>
@@ -5544,23 +5597,7 @@
           <w:rFonts w:eastAsia="Times New Roman"/>
           <w:lang w:val="en-GB"/>
         </w:rPr>
-        <w:t xml:space="preserve">Proficient in </w:t>
-      </w:r>
-      <w:proofErr w:type="spellStart"/>
-      <w:r>
-        <w:rPr>
-          <w:rFonts w:eastAsia="Times New Roman"/>
-          <w:lang w:val="en-GB"/>
-        </w:rPr>
-        <w:t>ForgeRock</w:t>
-      </w:r>
-      <w:proofErr w:type="spellEnd"/>
-      <w:r>
-        <w:rPr>
-          <w:rFonts w:eastAsia="Times New Roman"/>
-          <w:lang w:val="en-GB"/>
-        </w:rPr>
-        <w:t xml:space="preserve"> Identity Platform components: Access Management (AM), Identity Gateway (IG), Identity Manager (IDM), and Remote Consent Service (RCS).</w:t>
+        <w:t>Proficient in ForgeRock Identity Platform components: Access Management (AM), Identity Gateway (IG), Identity Manager (IDM), and Remote Consent Service (RCS).</w:t>
       </w:r>
     </w:p>
     <w:p>
@@ -5580,23 +5617,7 @@
           <w:rFonts w:eastAsia="Times New Roman"/>
           <w:lang w:val="en-GB"/>
         </w:rPr>
-        <w:t xml:space="preserve">Implemented Google's Invisible </w:t>
-      </w:r>
-      <w:proofErr w:type="spellStart"/>
-      <w:r>
-        <w:rPr>
-          <w:rFonts w:eastAsia="Times New Roman"/>
-          <w:lang w:val="en-GB"/>
-        </w:rPr>
-        <w:t>reCAPTCHA</w:t>
-      </w:r>
-      <w:proofErr w:type="spellEnd"/>
-      <w:r>
-        <w:rPr>
-          <w:rFonts w:eastAsia="Times New Roman"/>
-          <w:lang w:val="en-GB"/>
-        </w:rPr>
-        <w:t xml:space="preserve"> service to validate client authenticity and automate valid client journey testing.</w:t>
+        <w:t>Implemented Google's Invisible reCAPTCHA service to validate client authenticity and automate valid client journey testing.</w:t>
       </w:r>
     </w:p>
     <w:p>
@@ -5610,7 +5631,6 @@
           <w:sz w:val="22"/>
           <w:lang w:val="en-GB" w:eastAsia="en-GB" w:bidi="ar-SA"/>
         </w:rPr>
-        <w:lastRenderedPageBreak/>
         <mc:AlternateContent>
           <mc:Choice Requires="wpg">
             <w:drawing>
@@ -6636,13 +6656,7 @@
                                 <w:rPr>
                                   <w:rFonts w:ascii="Times New Roman" w:eastAsia="Times New Roman" w:hAnsi="Times New Roman" w:cs="Times New Roman"/>
                                 </w:rPr>
-                                <w:t xml:space="preserve"> </w:t>
-                              </w:r>
-                              <w:r>
-                                <w:rPr>
-                                  <w:rFonts w:ascii="Times New Roman" w:eastAsia="Times New Roman" w:hAnsi="Times New Roman" w:cs="Times New Roman"/>
-                                </w:rPr>
-                                <w:t>%</w:t>
+                                <w:t xml:space="preserve"> %</w:t>
                               </w:r>
                             </w:p>
                           </w:txbxContent>
@@ -7910,12 +7924,12 @@
           </mc:Choice>
           <mc:Fallback>
             <w:pict>
-              <v:group w14:anchorId="15283B98" id="Group 7118" o:spid="_x0000_s1034" style="width:470.6pt;height:124.75pt;mso-position-horizontal-relative:char;mso-position-vertical-relative:line" coordsize="59766,15844" o:gfxdata="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">
-                <v:shape id="Shape 7951" o:spid="_x0000_s1035" style="position:absolute;width:59632;height:1511;visibility:visible;mso-wrap-style:square;v-text-anchor:top" coordsize="5963285,151143" o:gfxdata="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" path="m,l5963285,r,151143l,151143,,e" fillcolor="#d9d9d9" stroked="f" strokeweight="0">
+              <v:group w14:anchorId="15283B98" id="Group 7118" o:spid="_x0000_s1034" style="width:470.6pt;height:124.75pt;mso-position-horizontal-relative:char;mso-position-vertical-relative:line" coordsize="59766,15844" o:gfxdata="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">
+                <v:shape id="Shape 7951" o:spid="_x0000_s1035" style="position:absolute;width:59632;height:1511;visibility:visible;mso-wrap-style:square;v-text-anchor:top" coordsize="5963285,151143" o:gfxdata="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" path="m,l5963285,r,151143l,151143,,e" fillcolor="#d9d9d9" stroked="f" strokeweight="0">
                   <v:stroke miterlimit="83231f" joinstyle="miter"/>
                   <v:path arrowok="t" textboxrect="0,0,5963285,151143"/>
                 </v:shape>
-                <v:rect id="Rectangle 537" o:spid="_x0000_s1036" style="position:absolute;left:165;top:292;width:22327;height:1359;visibility:visible;mso-wrap-style:square;v-text-anchor:top" o:gfxdata="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" filled="f" stroked="f">
+                <v:rect id="Rectangle 537" o:spid="_x0000_s1036" style="position:absolute;left:165;top:292;width:22327;height:1359;visibility:visible;mso-wrap-style:square;v-text-anchor:top" o:gfxdata="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" filled="f" stroked="f">
                   <v:textbox inset="0,0,0,0">
                     <w:txbxContent>
                       <w:p>
@@ -7944,11 +7958,11 @@
                     </w:txbxContent>
                   </v:textbox>
                 </v:rect>
-                <v:shape id="Shape 7952" o:spid="_x0000_s1037" style="position:absolute;top:1511;width:59766;height:1511;visibility:visible;mso-wrap-style:square;v-text-anchor:top" coordsize="5976621,151143" o:gfxdata="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" path="m,l5976621,r,151143l,151143,,e" stroked="f" strokeweight="0">
+                <v:shape id="Shape 7952" o:spid="_x0000_s1037" style="position:absolute;top:1511;width:59766;height:1511;visibility:visible;mso-wrap-style:square;v-text-anchor:top" coordsize="5976621,151143" o:gfxdata="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" path="m,l5976621,r,151143l,151143,,e" stroked="f" strokeweight="0">
                   <v:stroke miterlimit="83231f" joinstyle="miter"/>
                   <v:path arrowok="t" textboxrect="0,0,5976621,151143"/>
                 </v:shape>
-                <v:rect id="Rectangle 541" o:spid="_x0000_s1038" style="position:absolute;left:2311;top:3442;width:6583;height:1359;visibility:visible;mso-wrap-style:square;v-text-anchor:top" o:gfxdata="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" filled="f" stroked="f">
+                <v:rect id="Rectangle 541" o:spid="_x0000_s1038" style="position:absolute;left:2311;top:3442;width:6583;height:1359;visibility:visible;mso-wrap-style:square;v-text-anchor:top" o:gfxdata="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" filled="f" stroked="f">
                   <v:textbox inset="0,0,0,0">
                     <w:txbxContent>
                       <w:p>
@@ -7967,7 +7981,7 @@
                     </w:txbxContent>
                   </v:textbox>
                 </v:rect>
-                <v:rect id="Rectangle 542" o:spid="_x0000_s1039" style="position:absolute;left:2311;top:4954;width:3037;height:1358;visibility:visible;mso-wrap-style:square;v-text-anchor:top" o:gfxdata="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" filled="f" stroked="f">
+                <v:rect id="Rectangle 542" o:spid="_x0000_s1039" style="position:absolute;left:2311;top:4954;width:3037;height:1358;visibility:visible;mso-wrap-style:square;v-text-anchor:top" o:gfxdata="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" filled="f" stroked="f">
                   <v:textbox inset="0,0,0,0">
                     <w:txbxContent>
                       <w:p>
@@ -7986,7 +8000,7 @@
                     </w:txbxContent>
                   </v:textbox>
                 </v:rect>
-                <v:rect id="Rectangle 545" o:spid="_x0000_s1040" style="position:absolute;left:10312;top:3442;width:8273;height:1359;visibility:visible;mso-wrap-style:square;v-text-anchor:top" o:gfxdata="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" filled="f" stroked="f">
+                <v:rect id="Rectangle 545" o:spid="_x0000_s1040" style="position:absolute;left:10312;top:3442;width:8273;height:1359;visibility:visible;mso-wrap-style:square;v-text-anchor:top" o:gfxdata="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" filled="f" stroked="f">
                   <v:textbox inset="0,0,0,0">
                     <w:txbxContent>
                       <w:p>
@@ -8005,7 +8019,7 @@
                     </w:txbxContent>
                   </v:textbox>
                 </v:rect>
-                <v:rect id="Rectangle 548" o:spid="_x0000_s1041" style="position:absolute;left:24314;top:3442;width:9540;height:1359;visibility:visible;mso-wrap-style:square;v-text-anchor:top" o:gfxdata="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" filled="f" stroked="f">
+                <v:rect id="Rectangle 548" o:spid="_x0000_s1041" style="position:absolute;left:24314;top:3442;width:9540;height:1359;visibility:visible;mso-wrap-style:square;v-text-anchor:top" o:gfxdata="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" filled="f" stroked="f">
                   <v:textbox inset="0,0,0,0">
                     <w:txbxContent>
                       <w:p>
@@ -8024,7 +8038,7 @@
                     </w:txbxContent>
                   </v:textbox>
                 </v:rect>
-                <v:rect id="Rectangle 551" o:spid="_x0000_s1042" style="position:absolute;left:35839;top:3442;width:9027;height:1359;visibility:visible;mso-wrap-style:square;v-text-anchor:top" o:gfxdata="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" filled="f" stroked="f">
+                <v:rect id="Rectangle 551" o:spid="_x0000_s1042" style="position:absolute;left:35839;top:3442;width:9027;height:1359;visibility:visible;mso-wrap-style:square;v-text-anchor:top" o:gfxdata="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" filled="f" stroked="f">
                   <v:textbox inset="0,0,0,0">
                     <w:txbxContent>
                       <w:p>
@@ -8043,7 +8057,7 @@
                     </w:txbxContent>
                   </v:textbox>
                 </v:rect>
-                <v:rect id="Rectangle 554" o:spid="_x0000_s1043" style="position:absolute;left:47364;top:3442;width:4725;height:1359;visibility:visible;mso-wrap-style:square;v-text-anchor:top" o:gfxdata="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" filled="f" stroked="f">
+                <v:rect id="Rectangle 554" o:spid="_x0000_s1043" style="position:absolute;left:47364;top:3442;width:4725;height:1359;visibility:visible;mso-wrap-style:square;v-text-anchor:top" o:gfxdata="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" filled="f" stroked="f">
                   <v:textbox inset="0,0,0,0">
                     <w:txbxContent>
                       <w:p>
@@ -8062,7 +8076,7 @@
                     </w:txbxContent>
                   </v:textbox>
                 </v:rect>
-                <v:rect id="Rectangle 557" o:spid="_x0000_s1044" style="position:absolute;left:2311;top:6733;width:7513;height:1382;visibility:visible;mso-wrap-style:square;v-text-anchor:top" o:gfxdata="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" filled="f" stroked="f">
+                <v:rect id="Rectangle 557" o:spid="_x0000_s1044" style="position:absolute;left:2311;top:6733;width:7513;height:1382;visibility:visible;mso-wrap-style:square;v-text-anchor:top" o:gfxdata="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" filled="f" stroked="f">
                   <v:textbox inset="0,0,0,0">
                     <w:txbxContent>
                       <w:p>
@@ -8080,7 +8094,7 @@
                     </w:txbxContent>
                   </v:textbox>
                 </v:rect>
-                <v:rect id="Rectangle 558" o:spid="_x0000_s1045" style="position:absolute;left:2311;top:8244;width:7803;height:1383;visibility:visible;mso-wrap-style:square;v-text-anchor:top" o:gfxdata="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" filled="f" stroked="f">
+                <v:rect id="Rectangle 558" o:spid="_x0000_s1045" style="position:absolute;left:2311;top:8244;width:7803;height:1383;visibility:visible;mso-wrap-style:square;v-text-anchor:top" o:gfxdata="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" filled="f" stroked="f">
                   <v:textbox inset="0,0,0,0">
                     <w:txbxContent>
                       <w:p>
@@ -8098,7 +8112,7 @@
                     </w:txbxContent>
                   </v:textbox>
                 </v:rect>
-                <v:rect id="Rectangle 560" o:spid="_x0000_s1046" style="position:absolute;left:2311;top:9755;width:7599;height:1383;visibility:visible;mso-wrap-style:square;v-text-anchor:top" o:gfxdata="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" filled="f" stroked="f">
+                <v:rect id="Rectangle 560" o:spid="_x0000_s1046" style="position:absolute;left:2311;top:9755;width:7599;height:1383;visibility:visible;mso-wrap-style:square;v-text-anchor:top" o:gfxdata="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" filled="f" stroked="f">
                   <v:textbox inset="0,0,0,0">
                     <w:txbxContent>
                       <w:p>
@@ -8116,7 +8130,7 @@
                     </w:txbxContent>
                   </v:textbox>
                 </v:rect>
-                <v:rect id="Rectangle 563" o:spid="_x0000_s1047" style="position:absolute;left:10312;top:6733;width:14807;height:1382;visibility:visible;mso-wrap-style:square;v-text-anchor:top" o:gfxdata="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" filled="f" stroked="f">
+                <v:rect id="Rectangle 563" o:spid="_x0000_s1047" style="position:absolute;left:10312;top:6733;width:14807;height:1382;visibility:visible;mso-wrap-style:square;v-text-anchor:top" o:gfxdata="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" filled="f" stroked="f">
                   <v:textbox inset="0,0,0,0">
                     <w:txbxContent>
                       <w:p>
@@ -8142,7 +8156,7 @@
                     </w:txbxContent>
                   </v:textbox>
                 </v:rect>
-                <v:rect id="Rectangle 564" o:spid="_x0000_s1048" style="position:absolute;left:10312;top:8244;width:9703;height:1383;visibility:visible;mso-wrap-style:square;v-text-anchor:top" o:gfxdata="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" filled="f" stroked="f">
+                <v:rect id="Rectangle 564" o:spid="_x0000_s1048" style="position:absolute;left:10312;top:8244;width:9703;height:1383;visibility:visible;mso-wrap-style:square;v-text-anchor:top" o:gfxdata="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" filled="f" stroked="f">
                   <v:textbox inset="0,0,0,0">
                     <w:txbxContent>
                       <w:p>
@@ -8160,7 +8174,7 @@
                     </w:txbxContent>
                   </v:textbox>
                 </v:rect>
-                <v:rect id="Rectangle 565" o:spid="_x0000_s1049" style="position:absolute;left:10312;top:9755;width:14597;height:1383;visibility:visible;mso-wrap-style:square;v-text-anchor:top" o:gfxdata="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" filled="f" stroked="f">
+                <v:rect id="Rectangle 565" o:spid="_x0000_s1049" style="position:absolute;left:10312;top:9755;width:14597;height:1383;visibility:visible;mso-wrap-style:square;v-text-anchor:top" o:gfxdata="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" filled="f" stroked="f">
                   <v:textbox inset="0,0,0,0">
                     <w:txbxContent>
                       <w:p>
@@ -8184,7 +8198,7 @@
                     </w:txbxContent>
                   </v:textbox>
                 </v:rect>
-                <v:rect id="Rectangle 566" o:spid="_x0000_s1050" style="position:absolute;left:10312;top:11267;width:5739;height:1383;visibility:visible;mso-wrap-style:square;v-text-anchor:top" o:gfxdata="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" filled="f" stroked="f">
+                <v:rect id="Rectangle 566" o:spid="_x0000_s1050" style="position:absolute;left:10312;top:11267;width:5739;height:1383;visibility:visible;mso-wrap-style:square;v-text-anchor:top" o:gfxdata="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" filled="f" stroked="f">
                   <v:textbox inset="0,0,0,0">
                     <w:txbxContent>
                       <w:p>
@@ -8202,7 +8216,7 @@
                     </w:txbxContent>
                   </v:textbox>
                 </v:rect>
-                <v:rect id="Rectangle 569" o:spid="_x0000_s1051" style="position:absolute;left:24314;top:6733;width:8820;height:1382;visibility:visible;mso-wrap-style:square;v-text-anchor:top" o:gfxdata="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" filled="f" stroked="f">
+                <v:rect id="Rectangle 569" o:spid="_x0000_s1051" style="position:absolute;left:24314;top:6733;width:8820;height:1382;visibility:visible;mso-wrap-style:square;v-text-anchor:top" o:gfxdata="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" filled="f" stroked="f">
                   <v:textbox inset="0,0,0,0">
                     <w:txbxContent>
                       <w:p>
@@ -8220,7 +8234,7 @@
                     </w:txbxContent>
                   </v:textbox>
                 </v:rect>
-                <v:rect id="Rectangle 572" o:spid="_x0000_s1052" style="position:absolute;left:35839;top:6733;width:9793;height:1382;visibility:visible;mso-wrap-style:square;v-text-anchor:top" o:gfxdata="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" filled="f" stroked="f">
+                <v:rect id="Rectangle 572" o:spid="_x0000_s1052" style="position:absolute;left:35839;top:6733;width:9793;height:1382;visibility:visible;mso-wrap-style:square;v-text-anchor:top" o:gfxdata="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" filled="f" stroked="f">
                   <v:textbox inset="0,0,0,0">
                     <w:txbxContent>
                       <w:p>
@@ -8238,7 +8252,7 @@
                     </w:txbxContent>
                   </v:textbox>
                 </v:rect>
-                <v:rect id="Rectangle 573" o:spid="_x0000_s1053" style="position:absolute;left:35839;top:8244;width:10038;height:1383;visibility:visible;mso-wrap-style:square;v-text-anchor:top" o:gfxdata="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" filled="f" stroked="f">
+                <v:rect id="Rectangle 573" o:spid="_x0000_s1053" style="position:absolute;left:35839;top:8244;width:10038;height:1383;visibility:visible;mso-wrap-style:square;v-text-anchor:top" o:gfxdata="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" filled="f" stroked="f">
                   <v:textbox inset="0,0,0,0">
                     <w:txbxContent>
                       <w:p>
@@ -8256,7 +8270,7 @@
                     </w:txbxContent>
                   </v:textbox>
                 </v:rect>
-                <v:rect id="Rectangle 5578" o:spid="_x0000_s1054" style="position:absolute;left:49936;top:6733;width:1266;height:1382;visibility:visible;mso-wrap-style:square;v-text-anchor:top" o:gfxdata="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" filled="f" stroked="f">
+                <v:rect id="Rectangle 5578" o:spid="_x0000_s1054" style="position:absolute;left:49936;top:6733;width:1266;height:1382;visibility:visible;mso-wrap-style:square;v-text-anchor:top" o:gfxdata="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" filled="f" stroked="f">
                   <v:textbox inset="0,0,0,0">
                     <w:txbxContent>
                       <w:p>
@@ -8274,7 +8288,7 @@
                     </w:txbxContent>
                   </v:textbox>
                 </v:rect>
-                <v:rect id="Rectangle 5577" o:spid="_x0000_s1055" style="position:absolute;left:47364;top:6733;width:3421;height:1382;visibility:visible;mso-wrap-style:square;v-text-anchor:top" o:gfxdata="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" filled="f" stroked="f">
+                <v:rect id="Rectangle 5577" o:spid="_x0000_s1055" style="position:absolute;left:47364;top:6733;width:3421;height:1382;visibility:visible;mso-wrap-style:square;v-text-anchor:top" o:gfxdata="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" filled="f" stroked="f">
                   <v:textbox inset="0,0,0,0">
                     <w:txbxContent>
                       <w:p>
@@ -8292,7 +8306,7 @@
                     </w:txbxContent>
                   </v:textbox>
                 </v:rect>
-                <v:rect id="Rectangle 580" o:spid="_x0000_s1056" style="position:absolute;left:2311;top:12905;width:7388;height:1383;visibility:visible;mso-wrap-style:square;v-text-anchor:top" o:gfxdata="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" filled="f" stroked="f">
+                <v:rect id="Rectangle 580" o:spid="_x0000_s1056" style="position:absolute;left:2311;top:12905;width:7388;height:1383;visibility:visible;mso-wrap-style:square;v-text-anchor:top" o:gfxdata="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" filled="f" stroked="f">
                   <v:textbox inset="0,0,0,0">
                     <w:txbxContent>
                       <w:p>
@@ -8310,7 +8324,7 @@
                     </w:txbxContent>
                   </v:textbox>
                 </v:rect>
-                <v:rect id="Rectangle 583" o:spid="_x0000_s1057" style="position:absolute;left:10312;top:12905;width:8989;height:1383;visibility:visible;mso-wrap-style:square;v-text-anchor:top" o:gfxdata="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" filled="f" stroked="f">
+                <v:rect id="Rectangle 583" o:spid="_x0000_s1057" style="position:absolute;left:10312;top:12905;width:8989;height:1383;visibility:visible;mso-wrap-style:square;v-text-anchor:top" o:gfxdata="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" filled="f" stroked="f">
                   <v:textbox inset="0,0,0,0">
                     <w:txbxContent>
                       <w:p>
@@ -8328,7 +8342,7 @@
                     </w:txbxContent>
                   </v:textbox>
                 </v:rect>
-                <v:rect id="Rectangle 586" o:spid="_x0000_s1058" style="position:absolute;left:24314;top:12905;width:7894;height:1383;visibility:visible;mso-wrap-style:square;v-text-anchor:top" o:gfxdata="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" filled="f" stroked="f">
+                <v:rect id="Rectangle 586" o:spid="_x0000_s1058" style="position:absolute;left:24314;top:12905;width:7894;height:1383;visibility:visible;mso-wrap-style:square;v-text-anchor:top" o:gfxdata="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" filled="f" stroked="f">
                   <v:textbox inset="0,0,0,0">
                     <w:txbxContent>
                       <w:p>
@@ -8346,7 +8360,7 @@
                     </w:txbxContent>
                   </v:textbox>
                 </v:rect>
-                <v:rect id="Rectangle 589" o:spid="_x0000_s1059" style="position:absolute;left:35839;top:12905;width:3209;height:1383;visibility:visible;mso-wrap-style:square;v-text-anchor:top" o:gfxdata="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" filled="f" stroked="f">
+                <v:rect id="Rectangle 589" o:spid="_x0000_s1059" style="position:absolute;left:35839;top:12905;width:3209;height:1383;visibility:visible;mso-wrap-style:square;v-text-anchor:top" o:gfxdata="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" filled="f" stroked="f">
                   <v:textbox inset="0,0,0,0">
                     <w:txbxContent>
                       <w:p>
@@ -8364,7 +8378,7 @@
                     </w:txbxContent>
                   </v:textbox>
                 </v:rect>
-                <v:rect id="Rectangle 5579" o:spid="_x0000_s1060" style="position:absolute;left:47364;top:12905;width:2660;height:1383;visibility:visible;mso-wrap-style:square;v-text-anchor:top" o:gfxdata="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" filled="f" stroked="f">
+                <v:rect id="Rectangle 5579" o:spid="_x0000_s1060" style="position:absolute;left:47364;top:12905;width:2660;height:1383;visibility:visible;mso-wrap-style:square;v-text-anchor:top" o:gfxdata="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" filled="f" stroked="f">
                   <v:textbox inset="0,0,0,0">
                     <w:txbxContent>
                       <w:p>
@@ -8382,7 +8396,7 @@
                     </w:txbxContent>
                   </v:textbox>
                 </v:rect>
-                <v:rect id="Rectangle 5580" o:spid="_x0000_s1061" style="position:absolute;left:49364;top:12905;width:1647;height:1383;visibility:visible;mso-wrap-style:square;v-text-anchor:top" o:gfxdata="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" filled="f" stroked="f">
+                <v:rect id="Rectangle 5580" o:spid="_x0000_s1061" style="position:absolute;left:49364;top:12905;width:1647;height:1383;visibility:visible;mso-wrap-style:square;v-text-anchor:top" o:gfxdata="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" filled="f" stroked="f">
                   <v:textbox inset="0,0,0,0">
                     <w:txbxContent>
                       <w:p>
@@ -8406,7 +8420,7 @@
                     </w:txbxContent>
                   </v:textbox>
                 </v:rect>
-                <v:rect id="Rectangle 595" o:spid="_x0000_s1062" style="position:absolute;left:2311;top:14544;width:6756;height:1383;visibility:visible;mso-wrap-style:square;v-text-anchor:top" o:gfxdata="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" filled="f" stroked="f">
+                <v:rect id="Rectangle 595" o:spid="_x0000_s1062" style="position:absolute;left:2311;top:14544;width:6756;height:1383;visibility:visible;mso-wrap-style:square;v-text-anchor:top" o:gfxdata="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" filled="f" stroked="f">
                   <v:textbox inset="0,0,0,0">
                     <w:txbxContent>
                       <w:p>
@@ -8430,7 +8444,7 @@
                     </w:txbxContent>
                   </v:textbox>
                 </v:rect>
-                <v:rect id="Rectangle 598" o:spid="_x0000_s1063" style="position:absolute;left:10312;top:14544;width:8989;height:1383;visibility:visible;mso-wrap-style:square;v-text-anchor:top" o:gfxdata="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" filled="f" stroked="f">
+                <v:rect id="Rectangle 598" o:spid="_x0000_s1063" style="position:absolute;left:10312;top:14544;width:8989;height:1383;visibility:visible;mso-wrap-style:square;v-text-anchor:top" o:gfxdata="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" filled="f" stroked="f">
                   <v:textbox inset="0,0,0,0">
                     <w:txbxContent>
                       <w:p>
@@ -8448,7 +8462,7 @@
                     </w:txbxContent>
                   </v:textbox>
                 </v:rect>
-                <v:rect id="Rectangle 601" o:spid="_x0000_s1064" style="position:absolute;left:24314;top:14544;width:7894;height:1383;visibility:visible;mso-wrap-style:square;v-text-anchor:top" o:gfxdata="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" filled="f" stroked="f">
+                <v:rect id="Rectangle 601" o:spid="_x0000_s1064" style="position:absolute;left:24314;top:14544;width:7894;height:1383;visibility:visible;mso-wrap-style:square;v-text-anchor:top" o:gfxdata="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" filled="f" stroked="f">
                   <v:textbox inset="0,0,0,0">
                     <w:txbxContent>
                       <w:p>
@@ -8466,7 +8480,7 @@
                     </w:txbxContent>
                   </v:textbox>
                 </v:rect>
-                <v:rect id="Rectangle 604" o:spid="_x0000_s1065" style="position:absolute;left:35839;top:14544;width:3209;height:1383;visibility:visible;mso-wrap-style:square;v-text-anchor:top" o:gfxdata="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" filled="f" stroked="f">
+                <v:rect id="Rectangle 604" o:spid="_x0000_s1065" style="position:absolute;left:35839;top:14544;width:3209;height:1383;visibility:visible;mso-wrap-style:square;v-text-anchor:top" o:gfxdata="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" filled="f" stroked="f">
                   <v:textbox inset="0,0,0,0">
                     <w:txbxContent>
                       <w:p>
@@ -8484,7 +8498,7 @@
                     </w:txbxContent>
                   </v:textbox>
                 </v:rect>
-                <v:rect id="Rectangle 5581" o:spid="_x0000_s1066" style="position:absolute;left:47364;top:14544;width:2660;height:1383;visibility:visible;mso-wrap-style:square;v-text-anchor:top" o:gfxdata="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" filled="f" stroked="f">
+                <v:rect id="Rectangle 5581" o:spid="_x0000_s1066" style="position:absolute;left:47364;top:14544;width:2660;height:1383;visibility:visible;mso-wrap-style:square;v-text-anchor:top" o:gfxdata="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" filled="f" stroked="f">
                   <v:textbox inset="0,0,0,0">
                     <w:txbxContent>
                       <w:p>
@@ -8502,7 +8516,7 @@
                     </w:txbxContent>
                   </v:textbox>
                 </v:rect>
-                <v:rect id="Rectangle 5582" o:spid="_x0000_s1067" style="position:absolute;left:49364;top:14544;width:1267;height:1383;visibility:visible;mso-wrap-style:square;v-text-anchor:top" o:gfxdata="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" filled="f" stroked="f">
+                <v:rect id="Rectangle 5582" o:spid="_x0000_s1067" style="position:absolute;left:49364;top:14544;width:1267;height:1383;visibility:visible;mso-wrap-style:square;v-text-anchor:top" o:gfxdata="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" filled="f" stroked="f">
                   <v:textbox inset="0,0,0,0">
                     <w:txbxContent>
                       <w:p>
@@ -8520,95 +8534,95 @@
                     </w:txbxContent>
                   </v:textbox>
                 </v:rect>
-                <v:shape id="Shape 608" o:spid="_x0000_s1068" style="position:absolute;left:1625;top:3149;width:0;height:12632;visibility:visible;mso-wrap-style:square;v-text-anchor:top" coordsize="0,1263117" o:gfxdata="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" path="m,l,1263117e" filled="f" strokecolor="gray" strokeweight="1pt">
+                <v:shape id="Shape 608" o:spid="_x0000_s1068" style="position:absolute;left:1625;top:3149;width:0;height:12632;visibility:visible;mso-wrap-style:square;v-text-anchor:top" coordsize="0,1263117" o:gfxdata="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" path="m,l,1263117e" filled="f" strokecolor="gray" strokeweight="1pt">
                   <v:stroke miterlimit="83231f" joinstyle="miter"/>
                   <v:path arrowok="t" textboxrect="0,0,0,1263117"/>
                 </v:shape>
-                <v:shape id="Shape 609" o:spid="_x0000_s1069" style="position:absolute;left:9626;top:3149;width:0;height:3023;visibility:visible;mso-wrap-style:square;v-text-anchor:top" coordsize="0,302285" o:gfxdata="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" path="m,l,302285e" filled="f" strokecolor="gray" strokeweight="1pt">
+                <v:shape id="Shape 609" o:spid="_x0000_s1069" style="position:absolute;left:9626;top:3149;width:0;height:3023;visibility:visible;mso-wrap-style:square;v-text-anchor:top" coordsize="0,302285" o:gfxdata="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" path="m,l,302285e" filled="f" strokecolor="gray" strokeweight="1pt">
                   <v:stroke miterlimit="83231f" joinstyle="miter"/>
                   <v:path arrowok="t" textboxrect="0,0,0,302285"/>
                 </v:shape>
-                <v:shape id="Shape 610" o:spid="_x0000_s1070" style="position:absolute;left:9626;top:6458;width:0;height:6046;visibility:visible;mso-wrap-style:square;v-text-anchor:top" coordsize="0,604571" o:gfxdata="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" path="m,l,604571e" filled="f" strokecolor="gray" strokeweight="1pt">
+                <v:shape id="Shape 610" o:spid="_x0000_s1070" style="position:absolute;left:9626;top:6458;width:0;height:6046;visibility:visible;mso-wrap-style:square;v-text-anchor:top" coordsize="0,604571" o:gfxdata="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" path="m,l,604571e" filled="f" strokecolor="gray" strokeweight="1pt">
                   <v:stroke miterlimit="83231f" joinstyle="miter"/>
                   <v:path arrowok="t" textboxrect="0,0,0,604571"/>
                 </v:shape>
-                <v:shape id="Shape 611" o:spid="_x0000_s1071" style="position:absolute;left:9626;top:12631;width:0;height:1511;visibility:visible;mso-wrap-style:square;v-text-anchor:top" coordsize="0,151143" o:gfxdata="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" path="m,l,151143e" filled="f" strokecolor="gray" strokeweight="1pt">
+                <v:shape id="Shape 611" o:spid="_x0000_s1071" style="position:absolute;left:9626;top:12631;width:0;height:1511;visibility:visible;mso-wrap-style:square;v-text-anchor:top" coordsize="0,151143" o:gfxdata="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" path="m,l,151143e" filled="f" strokecolor="gray" strokeweight="1pt">
                   <v:stroke miterlimit="83231f" joinstyle="miter"/>
                   <v:path arrowok="t" textboxrect="0,0,0,151143"/>
                 </v:shape>
-                <v:shape id="Shape 612" o:spid="_x0000_s1072" style="position:absolute;left:9626;top:14269;width:0;height:1512;visibility:visible;mso-wrap-style:square;v-text-anchor:top" coordsize="0,151143" o:gfxdata="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" path="m,l,151143e" filled="f" strokecolor="gray" strokeweight="1pt">
+                <v:shape id="Shape 612" o:spid="_x0000_s1072" style="position:absolute;left:9626;top:14269;width:0;height:1512;visibility:visible;mso-wrap-style:square;v-text-anchor:top" coordsize="0,151143" o:gfxdata="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" path="m,l,151143e" filled="f" strokecolor="gray" strokeweight="1pt">
                   <v:stroke miterlimit="83231f" joinstyle="miter"/>
                   <v:path arrowok="t" textboxrect="0,0,0,151143"/>
                 </v:shape>
-                <v:shape id="Shape 613" o:spid="_x0000_s1073" style="position:absolute;left:23628;top:3149;width:0;height:3023;visibility:visible;mso-wrap-style:square;v-text-anchor:top" coordsize="0,302285" o:gfxdata="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" path="m,l,302285e" filled="f" strokecolor="gray" strokeweight="1pt">
+                <v:shape id="Shape 613" o:spid="_x0000_s1073" style="position:absolute;left:23628;top:3149;width:0;height:3023;visibility:visible;mso-wrap-style:square;v-text-anchor:top" coordsize="0,302285" o:gfxdata="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" path="m,l,302285e" filled="f" strokecolor="gray" strokeweight="1pt">
                   <v:stroke miterlimit="83231f" joinstyle="miter"/>
                   <v:path arrowok="t" textboxrect="0,0,0,302285"/>
                 </v:shape>
-                <v:shape id="Shape 614" o:spid="_x0000_s1074" style="position:absolute;left:23628;top:6458;width:0;height:6046;visibility:visible;mso-wrap-style:square;v-text-anchor:top" coordsize="0,604571" o:gfxdata="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" path="m,l,604571e" filled="f" strokecolor="gray" strokeweight="1pt">
+                <v:shape id="Shape 614" o:spid="_x0000_s1074" style="position:absolute;left:23628;top:6458;width:0;height:6046;visibility:visible;mso-wrap-style:square;v-text-anchor:top" coordsize="0,604571" o:gfxdata="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" path="m,l,604571e" filled="f" strokecolor="gray" strokeweight="1pt">
                   <v:stroke miterlimit="83231f" joinstyle="miter"/>
                   <v:path arrowok="t" textboxrect="0,0,0,604571"/>
                 </v:shape>
-                <v:shape id="Shape 615" o:spid="_x0000_s1075" style="position:absolute;left:23628;top:12631;width:0;height:1511;visibility:visible;mso-wrap-style:square;v-text-anchor:top" coordsize="0,151143" o:gfxdata="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" path="m,l,151143e" filled="f" strokecolor="gray" strokeweight="1pt">
+                <v:shape id="Shape 615" o:spid="_x0000_s1075" style="position:absolute;left:23628;top:12631;width:0;height:1511;visibility:visible;mso-wrap-style:square;v-text-anchor:top" coordsize="0,151143" o:gfxdata="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" path="m,l,151143e" filled="f" strokecolor="gray" strokeweight="1pt">
                   <v:stroke miterlimit="83231f" joinstyle="miter"/>
                   <v:path arrowok="t" textboxrect="0,0,0,151143"/>
                 </v:shape>
-                <v:shape id="Shape 616" o:spid="_x0000_s1076" style="position:absolute;left:23628;top:14269;width:0;height:1512;visibility:visible;mso-wrap-style:square;v-text-anchor:top" coordsize="0,151143" o:gfxdata="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" path="m,l,151143e" filled="f" strokecolor="gray" strokeweight="1pt">
+                <v:shape id="Shape 616" o:spid="_x0000_s1076" style="position:absolute;left:23628;top:14269;width:0;height:1512;visibility:visible;mso-wrap-style:square;v-text-anchor:top" coordsize="0,151143" o:gfxdata="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" path="m,l,151143e" filled="f" strokecolor="gray" strokeweight="1pt">
                   <v:stroke miterlimit="83231f" joinstyle="miter"/>
                   <v:path arrowok="t" textboxrect="0,0,0,151143"/>
                 </v:shape>
-                <v:shape id="Shape 617" o:spid="_x0000_s1077" style="position:absolute;left:35153;top:3149;width:0;height:3023;visibility:visible;mso-wrap-style:square;v-text-anchor:top" coordsize="0,302285" o:gfxdata="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" path="m,l,302285e" filled="f" strokecolor="gray" strokeweight="1pt">
+                <v:shape id="Shape 617" o:spid="_x0000_s1077" style="position:absolute;left:35153;top:3149;width:0;height:3023;visibility:visible;mso-wrap-style:square;v-text-anchor:top" coordsize="0,302285" o:gfxdata="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" path="m,l,302285e" filled="f" strokecolor="gray" strokeweight="1pt">
                   <v:stroke miterlimit="83231f" joinstyle="miter"/>
                   <v:path arrowok="t" textboxrect="0,0,0,302285"/>
                 </v:shape>
-                <v:shape id="Shape 618" o:spid="_x0000_s1078" style="position:absolute;left:35153;top:6458;width:0;height:6046;visibility:visible;mso-wrap-style:square;v-text-anchor:top" coordsize="0,604571" o:gfxdata="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" path="m,l,604571e" filled="f" strokecolor="gray" strokeweight="1pt">
+                <v:shape id="Shape 618" o:spid="_x0000_s1078" style="position:absolute;left:35153;top:6458;width:0;height:6046;visibility:visible;mso-wrap-style:square;v-text-anchor:top" coordsize="0,604571" o:gfxdata="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" path="m,l,604571e" filled="f" strokecolor="gray" strokeweight="1pt">
                   <v:stroke miterlimit="83231f" joinstyle="miter"/>
                   <v:path arrowok="t" textboxrect="0,0,0,604571"/>
                 </v:shape>
-                <v:shape id="Shape 619" o:spid="_x0000_s1079" style="position:absolute;left:35153;top:12631;width:0;height:1511;visibility:visible;mso-wrap-style:square;v-text-anchor:top" coordsize="0,151143" o:gfxdata="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" path="m,l,151143e" filled="f" strokecolor="gray" strokeweight="1pt">
+                <v:shape id="Shape 619" o:spid="_x0000_s1079" style="position:absolute;left:35153;top:12631;width:0;height:1511;visibility:visible;mso-wrap-style:square;v-text-anchor:top" coordsize="0,151143" o:gfxdata="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" path="m,l,151143e" filled="f" strokecolor="gray" strokeweight="1pt">
                   <v:stroke miterlimit="83231f" joinstyle="miter"/>
                   <v:path arrowok="t" textboxrect="0,0,0,151143"/>
                 </v:shape>
-                <v:shape id="Shape 620" o:spid="_x0000_s1080" style="position:absolute;left:35153;top:14269;width:0;height:1512;visibility:visible;mso-wrap-style:square;v-text-anchor:top" coordsize="0,151143" o:gfxdata="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" path="m,l,151143e" filled="f" strokecolor="gray" strokeweight="1pt">
+                <v:shape id="Shape 620" o:spid="_x0000_s1080" style="position:absolute;left:35153;top:14269;width:0;height:1512;visibility:visible;mso-wrap-style:square;v-text-anchor:top" coordsize="0,151143" o:gfxdata="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" path="m,l,151143e" filled="f" strokecolor="gray" strokeweight="1pt">
                   <v:stroke miterlimit="83231f" joinstyle="miter"/>
                   <v:path arrowok="t" textboxrect="0,0,0,151143"/>
                 </v:shape>
-                <v:shape id="Shape 621" o:spid="_x0000_s1081" style="position:absolute;left:46678;top:3149;width:0;height:3023;visibility:visible;mso-wrap-style:square;v-text-anchor:top" coordsize="0,302285" o:gfxdata="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" path="m,l,302285e" filled="f" strokecolor="gray" strokeweight="1pt">
+                <v:shape id="Shape 621" o:spid="_x0000_s1081" style="position:absolute;left:46678;top:3149;width:0;height:3023;visibility:visible;mso-wrap-style:square;v-text-anchor:top" coordsize="0,302285" o:gfxdata="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" path="m,l,302285e" filled="f" strokecolor="gray" strokeweight="1pt">
                   <v:stroke miterlimit="83231f" joinstyle="miter"/>
                   <v:path arrowok="t" textboxrect="0,0,0,302285"/>
                 </v:shape>
-                <v:shape id="Shape 622" o:spid="_x0000_s1082" style="position:absolute;left:46678;top:6458;width:0;height:6046;visibility:visible;mso-wrap-style:square;v-text-anchor:top" coordsize="0,604571" o:gfxdata="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" path="m,l,604571e" filled="f" strokecolor="gray" strokeweight="1pt">
+                <v:shape id="Shape 622" o:spid="_x0000_s1082" style="position:absolute;left:46678;top:6458;width:0;height:6046;visibility:visible;mso-wrap-style:square;v-text-anchor:top" coordsize="0,604571" o:gfxdata="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" path="m,l,604571e" filled="f" strokecolor="gray" strokeweight="1pt">
                   <v:stroke miterlimit="83231f" joinstyle="miter"/>
                   <v:path arrowok="t" textboxrect="0,0,0,604571"/>
                 </v:shape>
-                <v:shape id="Shape 623" o:spid="_x0000_s1083" style="position:absolute;left:46678;top:12631;width:0;height:1511;visibility:visible;mso-wrap-style:square;v-text-anchor:top" coordsize="0,151143" o:gfxdata="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" path="m,l,151143e" filled="f" strokecolor="gray" strokeweight="1pt">
+                <v:shape id="Shape 623" o:spid="_x0000_s1083" style="position:absolute;left:46678;top:12631;width:0;height:1511;visibility:visible;mso-wrap-style:square;v-text-anchor:top" coordsize="0,151143" o:gfxdata="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" path="m,l,151143e" filled="f" strokecolor="gray" strokeweight="1pt">
                   <v:stroke miterlimit="83231f" joinstyle="miter"/>
                   <v:path arrowok="t" textboxrect="0,0,0,151143"/>
                 </v:shape>
-                <v:shape id="Shape 624" o:spid="_x0000_s1084" style="position:absolute;left:46678;top:14269;width:0;height:1512;visibility:visible;mso-wrap-style:square;v-text-anchor:top" coordsize="0,151143" o:gfxdata="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" path="m,l,151143e" filled="f" strokecolor="gray" strokeweight="1pt">
+                <v:shape id="Shape 624" o:spid="_x0000_s1084" style="position:absolute;left:46678;top:14269;width:0;height:1512;visibility:visible;mso-wrap-style:square;v-text-anchor:top" coordsize="0,151143" o:gfxdata="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" path="m,l,151143e" filled="f" strokecolor="gray" strokeweight="1pt">
                   <v:stroke miterlimit="83231f" joinstyle="miter"/>
                   <v:path arrowok="t" textboxrect="0,0,0,151143"/>
                 </v:shape>
-                <v:shape id="Shape 625" o:spid="_x0000_s1085" style="position:absolute;left:58616;top:3149;width:0;height:12632;visibility:visible;mso-wrap-style:square;v-text-anchor:top" coordsize="0,1263117" o:gfxdata="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" path="m,l,1263117e" filled="f" strokecolor="gray" strokeweight="1pt">
+                <v:shape id="Shape 625" o:spid="_x0000_s1085" style="position:absolute;left:58616;top:3149;width:0;height:12632;visibility:visible;mso-wrap-style:square;v-text-anchor:top" coordsize="0,1263117" o:gfxdata="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" path="m,l,1263117e" filled="f" strokecolor="gray" strokeweight="1pt">
                   <v:stroke miterlimit="83231f" joinstyle="miter"/>
                   <v:path arrowok="t" textboxrect="0,0,0,1263117"/>
                 </v:shape>
-                <v:shape id="Shape 626" o:spid="_x0000_s1086" style="position:absolute;left:1562;top:3086;width:57118;height:0;visibility:visible;mso-wrap-style:square;v-text-anchor:top" coordsize="5711825,0" o:gfxdata="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" path="m,l5711825,e" filled="f" strokecolor="gray" strokeweight="1pt">
+                <v:shape id="Shape 626" o:spid="_x0000_s1086" style="position:absolute;left:1562;top:3086;width:57118;height:0;visibility:visible;mso-wrap-style:square;v-text-anchor:top" coordsize="5711825,0" o:gfxdata="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" path="m,l5711825,e" filled="f" strokecolor="gray" strokeweight="1pt">
                   <v:stroke miterlimit="83231f" joinstyle="miter"/>
                   <v:path arrowok="t" textboxrect="0,0,5711825,0"/>
                 </v:shape>
-                <v:shape id="Shape 627" o:spid="_x0000_s1087" style="position:absolute;left:1689;top:6315;width:56864;height:0;visibility:visible;mso-wrap-style:square;v-text-anchor:top" coordsize="5686425,0" o:gfxdata="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" path="m,l5686425,e" filled="f" strokecolor="gray" strokeweight="2.25pt">
+                <v:shape id="Shape 627" o:spid="_x0000_s1087" style="position:absolute;left:1689;top:6315;width:56864;height:0;visibility:visible;mso-wrap-style:square;v-text-anchor:top" coordsize="5686425,0" o:gfxdata="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" path="m,l5686425,e" filled="f" strokecolor="gray" strokeweight="2.25pt">
                   <v:stroke miterlimit="83231f" joinstyle="miter"/>
                   <v:path arrowok="t" textboxrect="0,0,5686425,0"/>
                 </v:shape>
-                <v:shape id="Shape 628" o:spid="_x0000_s1088" style="position:absolute;left:1689;top:12567;width:56864;height:0;visibility:visible;mso-wrap-style:square;v-text-anchor:top" coordsize="5686425,0" o:gfxdata="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" path="m,l5686425,e" filled="f" strokecolor="gray" strokeweight="1pt">
+                <v:shape id="Shape 628" o:spid="_x0000_s1088" style="position:absolute;left:1689;top:12567;width:56864;height:0;visibility:visible;mso-wrap-style:square;v-text-anchor:top" coordsize="5686425,0" o:gfxdata="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" path="m,l5686425,e" filled="f" strokecolor="gray" strokeweight="1pt">
                   <v:stroke miterlimit="83231f" joinstyle="miter"/>
                   <v:path arrowok="t" textboxrect="0,0,5686425,0"/>
                 </v:shape>
-                <v:shape id="Shape 629" o:spid="_x0000_s1089" style="position:absolute;left:1689;top:14206;width:56864;height:0;visibility:visible;mso-wrap-style:square;v-text-anchor:top" coordsize="5686425,0" o:gfxdata="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" path="m,l5686425,e" filled="f" strokecolor="gray" strokeweight="1pt">
+                <v:shape id="Shape 629" o:spid="_x0000_s1089" style="position:absolute;left:1689;top:14206;width:56864;height:0;visibility:visible;mso-wrap-style:square;v-text-anchor:top" coordsize="5686425,0" o:gfxdata="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" path="m,l5686425,e" filled="f" strokecolor="gray" strokeweight="1pt">
                   <v:stroke miterlimit="83231f" joinstyle="miter"/>
                   <v:path arrowok="t" textboxrect="0,0,5686425,0"/>
                 </v:shape>
-                <v:shape id="Shape 630" o:spid="_x0000_s1090" style="position:absolute;left:1562;top:15844;width:57118;height:0;visibility:visible;mso-wrap-style:square;v-text-anchor:top" coordsize="5711825,0" o:gfxdata="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" path="m,l5711825,e" filled="f" strokecolor="gray" strokeweight="1pt">
+                <v:shape id="Shape 630" o:spid="_x0000_s1090" style="position:absolute;left:1562;top:15844;width:57118;height:0;visibility:visible;mso-wrap-style:square;v-text-anchor:top" coordsize="5711825,0" o:gfxdata="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" path="m,l5711825,e" filled="f" strokecolor="gray" strokeweight="1pt">
                   <v:stroke miterlimit="83231f" joinstyle="miter"/>
                   <v:path arrowok="t" textboxrect="0,0,5711825,0"/>
                 </v:shape>
@@ -8701,13 +8715,8 @@
         <w:spacing w:after="0"/>
         <w:ind w:hanging="360"/>
       </w:pPr>
-      <w:proofErr w:type="spellStart"/>
-      <w:r>
-        <w:t>ForgeRock</w:t>
-      </w:r>
-      <w:proofErr w:type="spellEnd"/>
-      <w:r>
-        <w:t xml:space="preserve"> University course AM – 400 Rev </w:t>
+      <w:r>
+        <w:t xml:space="preserve">ForgeRock University course AM – 400 Rev </w:t>
       </w:r>
       <w:r>
         <w:t>B.1,</w:t>
@@ -8741,15 +8750,7 @@
         <w:ind w:hanging="360"/>
       </w:pPr>
       <w:r>
-        <w:t xml:space="preserve">Got </w:t>
-      </w:r>
-      <w:proofErr w:type="spellStart"/>
-      <w:r>
-        <w:t>ForgeRock</w:t>
-      </w:r>
-      <w:proofErr w:type="spellEnd"/>
-      <w:r>
-        <w:t xml:space="preserve"> Identity Cloud badges – Core and Managing User identities in 2022</w:t>
+        <w:t>Got ForgeRock Identity Cloud badges – Core and Managing User identities in 2022</w:t>
       </w:r>
     </w:p>
     <w:p>
@@ -8882,7 +8883,7 @@
 </file>
 
 <file path=word/endnotes.xml><?xml version="1.0" encoding="utf-8"?>
-<w:endnotes xmlns:wpc="http://schemas.microsoft.com/office/word/2010/wordprocessingCanvas" xmlns:cx="http://schemas.microsoft.com/office/drawing/2014/chartex" xmlns:cx1="http://schemas.microsoft.com/office/drawing/2015/9/8/chartex" xmlns:cx2="http://schemas.microsoft.com/office/drawing/2015/10/21/chartex" xmlns:cx3="http://schemas.microsoft.com/office/drawing/2016/5/9/chartex" xmlns:cx4="http://schemas.microsoft.com/office/drawing/2016/5/10/chartex" xmlns:cx5="http://schemas.microsoft.com/office/drawing/2016/5/11/chartex" xmlns:cx6="http://schemas.microsoft.com/office/drawing/2016/5/12/chartex" xmlns:cx7="http://schemas.microsoft.com/office/drawing/2016/5/13/chartex" xmlns:cx8="http://schemas.microsoft.com/office/drawing/2016/5/14/chartex" xmlns:mc="http://schemas.openxmlformats.org/markup-compatibility/2006" xmlns:aink="http://schemas.microsoft.com/office/drawing/2016/ink" xmlns:am3d="http://schemas.microsoft.com/office/drawing/2017/model3d" xmlns:o="urn:schemas-microsoft-com:office:office" xmlns:oel="http://schemas.microsoft.com/office/2019/extlst" xmlns:r="http://schemas.openxmlformats.org/officeDocument/2006/relationships" xmlns:m="http://schemas.openxmlformats.org/officeDocument/2006/math" xmlns:v="urn:schemas-microsoft-com:vml" xmlns:wp14="http://schemas.microsoft.com/office/word/2010/wordprocessingDrawing" xmlns:wp="http://schemas.openxmlformats.org/drawingml/2006/wordprocessingDrawing" xmlns:w10="urn:schemas-microsoft-com:office:word" xmlns:w="http://schemas.openxmlformats.org/wordprocessingml/2006/main" xmlns:w14="http://schemas.microsoft.com/office/word/2010/wordml" xmlns:w15="http://schemas.microsoft.com/office/word/2012/wordml" xmlns:w16cex="http://schemas.microsoft.com/office/word/2018/wordml/cex" xmlns:w16cid="http://schemas.microsoft.com/office/word/2016/wordml/cid" xmlns:w16="http://schemas.microsoft.com/office/word/2018/wordml" xmlns:w16sdtdh="http://schemas.microsoft.com/office/word/2020/wordml/sdtdatahash" xmlns:w16se="http://schemas.microsoft.com/office/word/2015/wordml/symex" xmlns:wpg="http://schemas.microsoft.com/office/word/2010/wordprocessingGroup" xmlns:wpi="http://schemas.microsoft.com/office/word/2010/wordprocessingInk" xmlns:wne="http://schemas.microsoft.com/office/word/2006/wordml" xmlns:wps="http://schemas.microsoft.com/office/word/2010/wordprocessingShape" mc:Ignorable="w14 w15 w16se w16cid w16 w16cex w16sdtdh wp14">
+<w:endnotes xmlns:wpc="http://schemas.microsoft.com/office/word/2010/wordprocessingCanvas" xmlns:cx="http://schemas.microsoft.com/office/drawing/2014/chartex" xmlns:cx1="http://schemas.microsoft.com/office/drawing/2015/9/8/chartex" xmlns:cx2="http://schemas.microsoft.com/office/drawing/2015/10/21/chartex" xmlns:cx3="http://schemas.microsoft.com/office/drawing/2016/5/9/chartex" xmlns:cx4="http://schemas.microsoft.com/office/drawing/2016/5/10/chartex" xmlns:cx5="http://schemas.microsoft.com/office/drawing/2016/5/11/chartex" xmlns:cx6="http://schemas.microsoft.com/office/drawing/2016/5/12/chartex" xmlns:cx7="http://schemas.microsoft.com/office/drawing/2016/5/13/chartex" xmlns:cx8="http://schemas.microsoft.com/office/drawing/2016/5/14/chartex" xmlns:mc="http://schemas.openxmlformats.org/markup-compatibility/2006" xmlns:aink="http://schemas.microsoft.com/office/drawing/2016/ink" xmlns:am3d="http://schemas.microsoft.com/office/drawing/2017/model3d" xmlns:o="urn:schemas-microsoft-com:office:office" xmlns:oel="http://schemas.microsoft.com/office/2019/extlst" xmlns:r="http://schemas.openxmlformats.org/officeDocument/2006/relationships" xmlns:m="http://schemas.openxmlformats.org/officeDocument/2006/math" xmlns:v="urn:schemas-microsoft-com:vml" xmlns:wp14="http://schemas.microsoft.com/office/word/2010/wordprocessingDrawing" xmlns:wp="http://schemas.openxmlformats.org/drawingml/2006/wordprocessingDrawing" xmlns:w10="urn:schemas-microsoft-com:office:word" xmlns:w="http://schemas.openxmlformats.org/wordprocessingml/2006/main" xmlns:w14="http://schemas.microsoft.com/office/word/2010/wordml" xmlns:w15="http://schemas.microsoft.com/office/word/2012/wordml" xmlns:w16cex="http://schemas.microsoft.com/office/word/2018/wordml/cex" xmlns:w16cid="http://schemas.microsoft.com/office/word/2016/wordml/cid" xmlns:w16="http://schemas.microsoft.com/office/word/2018/wordml" xmlns:w16du="http://schemas.microsoft.com/office/word/2023/wordml/word16du" xmlns:w16sdtdh="http://schemas.microsoft.com/office/word/2020/wordml/sdtdatahash" xmlns:w16sdtfl="http://schemas.microsoft.com/office/word/2024/wordml/sdtformatlock" xmlns:w16se="http://schemas.microsoft.com/office/word/2015/wordml/symex" xmlns:wpg="http://schemas.microsoft.com/office/word/2010/wordprocessingGroup" xmlns:wpi="http://schemas.microsoft.com/office/word/2010/wordprocessingInk" xmlns:wne="http://schemas.microsoft.com/office/word/2006/wordml" xmlns:wps="http://schemas.microsoft.com/office/word/2010/wordprocessingShape" mc:Ignorable="w14 w15 w16se w16cid w16 w16cex w16sdtdh w16sdtfl w16du wp14">
   <w:endnote w:type="separator" w:id="-1">
     <w:p>
       <w:pPr>
@@ -8907,7 +8908,7 @@
 </file>
 
 <file path=word/footer1.xml><?xml version="1.0" encoding="utf-8"?>
-<w:ftr xmlns:wpc="http://schemas.microsoft.com/office/word/2010/wordprocessingCanvas" xmlns:cx="http://schemas.microsoft.com/office/drawing/2014/chartex" xmlns:cx1="http://schemas.microsoft.com/office/drawing/2015/9/8/chartex" xmlns:cx2="http://schemas.microsoft.com/office/drawing/2015/10/21/chartex" xmlns:cx3="http://schemas.microsoft.com/office/drawing/2016/5/9/chartex" xmlns:cx4="http://schemas.microsoft.com/office/drawing/2016/5/10/chartex" xmlns:cx5="http://schemas.microsoft.com/office/drawing/2016/5/11/chartex" xmlns:cx6="http://schemas.microsoft.com/office/drawing/2016/5/12/chartex" xmlns:cx7="http://schemas.microsoft.com/office/drawing/2016/5/13/chartex" xmlns:cx8="http://schemas.microsoft.com/office/drawing/2016/5/14/chartex" xmlns:mc="http://schemas.openxmlformats.org/markup-compatibility/2006" xmlns:aink="http://schemas.microsoft.com/office/drawing/2016/ink" xmlns:am3d="http://schemas.microsoft.com/office/drawing/2017/model3d" xmlns:o="urn:schemas-microsoft-com:office:office" xmlns:oel="http://schemas.microsoft.com/office/2019/extlst" xmlns:r="http://schemas.openxmlformats.org/officeDocument/2006/relationships" xmlns:m="http://schemas.openxmlformats.org/officeDocument/2006/math" xmlns:v="urn:schemas-microsoft-com:vml" xmlns:wp14="http://schemas.microsoft.com/office/word/2010/wordprocessingDrawing" xmlns:wp="http://schemas.openxmlformats.org/drawingml/2006/wordprocessingDrawing" xmlns:w10="urn:schemas-microsoft-com:office:word" xmlns:w="http://schemas.openxmlformats.org/wordprocessingml/2006/main" xmlns:w14="http://schemas.microsoft.com/office/word/2010/wordml" xmlns:w15="http://schemas.microsoft.com/office/word/2012/wordml" xmlns:w16cex="http://schemas.microsoft.com/office/word/2018/wordml/cex" xmlns:w16cid="http://schemas.microsoft.com/office/word/2016/wordml/cid" xmlns:w16="http://schemas.microsoft.com/office/word/2018/wordml" xmlns:w16sdtdh="http://schemas.microsoft.com/office/word/2020/wordml/sdtdatahash" xmlns:w16se="http://schemas.microsoft.com/office/word/2015/wordml/symex" xmlns:wpg="http://schemas.microsoft.com/office/word/2010/wordprocessingGroup" xmlns:wpi="http://schemas.microsoft.com/office/word/2010/wordprocessingInk" xmlns:wne="http://schemas.microsoft.com/office/word/2006/wordml" xmlns:wps="http://schemas.microsoft.com/office/word/2010/wordprocessingShape" mc:Ignorable="w14 w15 w16se w16cid w16 w16cex w16sdtdh wp14">
+<w:ftr xmlns:wpc="http://schemas.microsoft.com/office/word/2010/wordprocessingCanvas" xmlns:cx="http://schemas.microsoft.com/office/drawing/2014/chartex" xmlns:cx1="http://schemas.microsoft.com/office/drawing/2015/9/8/chartex" xmlns:cx2="http://schemas.microsoft.com/office/drawing/2015/10/21/chartex" xmlns:cx3="http://schemas.microsoft.com/office/drawing/2016/5/9/chartex" xmlns:cx4="http://schemas.microsoft.com/office/drawing/2016/5/10/chartex" xmlns:cx5="http://schemas.microsoft.com/office/drawing/2016/5/11/chartex" xmlns:cx6="http://schemas.microsoft.com/office/drawing/2016/5/12/chartex" xmlns:cx7="http://schemas.microsoft.com/office/drawing/2016/5/13/chartex" xmlns:cx8="http://schemas.microsoft.com/office/drawing/2016/5/14/chartex" xmlns:mc="http://schemas.openxmlformats.org/markup-compatibility/2006" xmlns:aink="http://schemas.microsoft.com/office/drawing/2016/ink" xmlns:am3d="http://schemas.microsoft.com/office/drawing/2017/model3d" xmlns:o="urn:schemas-microsoft-com:office:office" xmlns:oel="http://schemas.microsoft.com/office/2019/extlst" xmlns:r="http://schemas.openxmlformats.org/officeDocument/2006/relationships" xmlns:m="http://schemas.openxmlformats.org/officeDocument/2006/math" xmlns:v="urn:schemas-microsoft-com:vml" xmlns:wp14="http://schemas.microsoft.com/office/word/2010/wordprocessingDrawing" xmlns:wp="http://schemas.openxmlformats.org/drawingml/2006/wordprocessingDrawing" xmlns:w10="urn:schemas-microsoft-com:office:word" xmlns:w="http://schemas.openxmlformats.org/wordprocessingml/2006/main" xmlns:w14="http://schemas.microsoft.com/office/word/2010/wordml" xmlns:w15="http://schemas.microsoft.com/office/word/2012/wordml" xmlns:w16cex="http://schemas.microsoft.com/office/word/2018/wordml/cex" xmlns:w16cid="http://schemas.microsoft.com/office/word/2016/wordml/cid" xmlns:w16="http://schemas.microsoft.com/office/word/2018/wordml" xmlns:w16du="http://schemas.microsoft.com/office/word/2023/wordml/word16du" xmlns:w16sdtdh="http://schemas.microsoft.com/office/word/2020/wordml/sdtdatahash" xmlns:w16sdtfl="http://schemas.microsoft.com/office/word/2024/wordml/sdtformatlock" xmlns:w16se="http://schemas.microsoft.com/office/word/2015/wordml/symex" xmlns:wpg="http://schemas.microsoft.com/office/word/2010/wordprocessingGroup" xmlns:wpi="http://schemas.microsoft.com/office/word/2010/wordprocessingInk" xmlns:wne="http://schemas.microsoft.com/office/word/2006/wordml" xmlns:wps="http://schemas.microsoft.com/office/word/2010/wordprocessingShape" mc:Ignorable="w14 w15 w16se w16cid w16 w16cex w16sdtdh w16sdtfl w16du wp14">
   <w:p>
     <w:pPr>
       <w:pStyle w:val="Footer"/>
@@ -8998,7 +8999,7 @@
               <v:stroke joinstyle="miter"/>
               <v:path gradientshapeok="t" o:connecttype="rect"/>
             </v:shapetype>
-            <v:shape id="MSIPCM78984b5d96200862251ba983" o:spid="_x0000_s1091" type="#_x0000_t202" alt="{&quot;HashCode&quot;:393461622,&quot;Height&quot;:792.0,&quot;Width&quot;:612.0,&quot;Placement&quot;:&quot;Footer&quot;,&quot;Index&quot;:&quot;Primary&quot;,&quot;Section&quot;:1,&quot;Top&quot;:0.0,&quot;Left&quot;:0.0}" style="position:absolute;left:0;text-align:left;margin-left:0;margin-top:755.45pt;width:612pt;height:21.5pt;z-index:251659264;visibility:visible;mso-wrap-style:square;mso-wrap-distance-left:9pt;mso-wrap-distance-top:0;mso-wrap-distance-right:9pt;mso-wrap-distance-bottom:0;mso-position-horizontal:absolute;mso-position-horizontal-relative:page;mso-position-vertical:absolute;mso-position-vertical-relative:page;v-text-anchor:bottom" o:gfxdata="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" o:allowincell="f" filled="f" stroked="f" strokeweight=".5pt">
+            <v:shape id="MSIPCM78984b5d96200862251ba983" o:spid="_x0000_s1091" type="#_x0000_t202" alt="{&quot;HashCode&quot;:393461622,&quot;Height&quot;:792.0,&quot;Width&quot;:612.0,&quot;Placement&quot;:&quot;Footer&quot;,&quot;Index&quot;:&quot;Primary&quot;,&quot;Section&quot;:1,&quot;Top&quot;:0.0,&quot;Left&quot;:0.0}" style="position:absolute;left:0;text-align:left;margin-left:0;margin-top:755.45pt;width:612pt;height:21.5pt;z-index:251659264;visibility:visible;mso-wrap-style:square;mso-wrap-distance-left:9pt;mso-wrap-distance-top:0;mso-wrap-distance-right:9pt;mso-wrap-distance-bottom:0;mso-position-horizontal:absolute;mso-position-horizontal-relative:page;mso-position-vertical:absolute;mso-position-vertical-relative:page;v-text-anchor:bottom" o:gfxdata="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" o:allowincell="f" filled="f" stroked="f" strokeweight=".5pt">
               <v:textbox inset=",0,20pt,0">
                 <w:txbxContent>
                   <w:p>
@@ -9032,7 +9033,7 @@
 </file>
 
 <file path=word/footnotes.xml><?xml version="1.0" encoding="utf-8"?>
-<w:footnotes xmlns:wpc="http://schemas.microsoft.com/office/word/2010/wordprocessingCanvas" xmlns:cx="http://schemas.microsoft.com/office/drawing/2014/chartex" xmlns:cx1="http://schemas.microsoft.com/office/drawing/2015/9/8/chartex" xmlns:cx2="http://schemas.microsoft.com/office/drawing/2015/10/21/chartex" xmlns:cx3="http://schemas.microsoft.com/office/drawing/2016/5/9/chartex" xmlns:cx4="http://schemas.microsoft.com/office/drawing/2016/5/10/chartex" xmlns:cx5="http://schemas.microsoft.com/office/drawing/2016/5/11/chartex" xmlns:cx6="http://schemas.microsoft.com/office/drawing/2016/5/12/chartex" xmlns:cx7="http://schemas.microsoft.com/office/drawing/2016/5/13/chartex" xmlns:cx8="http://schemas.microsoft.com/office/drawing/2016/5/14/chartex" xmlns:mc="http://schemas.openxmlformats.org/markup-compatibility/2006" xmlns:aink="http://schemas.microsoft.com/office/drawing/2016/ink" xmlns:am3d="http://schemas.microsoft.com/office/drawing/2017/model3d" xmlns:o="urn:schemas-microsoft-com:office:office" xmlns:oel="http://schemas.microsoft.com/office/2019/extlst" xmlns:r="http://schemas.openxmlformats.org/officeDocument/2006/relationships" xmlns:m="http://schemas.openxmlformats.org/officeDocument/2006/math" xmlns:v="urn:schemas-microsoft-com:vml" xmlns:wp14="http://schemas.microsoft.com/office/word/2010/wordprocessingDrawing" xmlns:wp="http://schemas.openxmlformats.org/drawingml/2006/wordprocessingDrawing" xmlns:w10="urn:schemas-microsoft-com:office:word" xmlns:w="http://schemas.openxmlformats.org/wordprocessingml/2006/main" xmlns:w14="http://schemas.microsoft.com/office/word/2010/wordml" xmlns:w15="http://schemas.microsoft.com/office/word/2012/wordml" xmlns:w16cex="http://schemas.microsoft.com/office/word/2018/wordml/cex" xmlns:w16cid="http://schemas.microsoft.com/office/word/2016/wordml/cid" xmlns:w16="http://schemas.microsoft.com/office/word/2018/wordml" xmlns:w16sdtdh="http://schemas.microsoft.com/office/word/2020/wordml/sdtdatahash" xmlns:w16se="http://schemas.microsoft.com/office/word/2015/wordml/symex" xmlns:wpg="http://schemas.microsoft.com/office/word/2010/wordprocessingGroup" xmlns:wpi="http://schemas.microsoft.com/office/word/2010/wordprocessingInk" xmlns:wne="http://schemas.microsoft.com/office/word/2006/wordml" xmlns:wps="http://schemas.microsoft.com/office/word/2010/wordprocessingShape" mc:Ignorable="w14 w15 w16se w16cid w16 w16cex w16sdtdh wp14">
+<w:footnotes xmlns:wpc="http://schemas.microsoft.com/office/word/2010/wordprocessingCanvas" xmlns:cx="http://schemas.microsoft.com/office/drawing/2014/chartex" xmlns:cx1="http://schemas.microsoft.com/office/drawing/2015/9/8/chartex" xmlns:cx2="http://schemas.microsoft.com/office/drawing/2015/10/21/chartex" xmlns:cx3="http://schemas.microsoft.com/office/drawing/2016/5/9/chartex" xmlns:cx4="http://schemas.microsoft.com/office/drawing/2016/5/10/chartex" xmlns:cx5="http://schemas.microsoft.com/office/drawing/2016/5/11/chartex" xmlns:cx6="http://schemas.microsoft.com/office/drawing/2016/5/12/chartex" xmlns:cx7="http://schemas.microsoft.com/office/drawing/2016/5/13/chartex" xmlns:cx8="http://schemas.microsoft.com/office/drawing/2016/5/14/chartex" xmlns:mc="http://schemas.openxmlformats.org/markup-compatibility/2006" xmlns:aink="http://schemas.microsoft.com/office/drawing/2016/ink" xmlns:am3d="http://schemas.microsoft.com/office/drawing/2017/model3d" xmlns:o="urn:schemas-microsoft-com:office:office" xmlns:oel="http://schemas.microsoft.com/office/2019/extlst" xmlns:r="http://schemas.openxmlformats.org/officeDocument/2006/relationships" xmlns:m="http://schemas.openxmlformats.org/officeDocument/2006/math" xmlns:v="urn:schemas-microsoft-com:vml" xmlns:wp14="http://schemas.microsoft.com/office/word/2010/wordprocessingDrawing" xmlns:wp="http://schemas.openxmlformats.org/drawingml/2006/wordprocessingDrawing" xmlns:w10="urn:schemas-microsoft-com:office:word" xmlns:w="http://schemas.openxmlformats.org/wordprocessingml/2006/main" xmlns:w14="http://schemas.microsoft.com/office/word/2010/wordml" xmlns:w15="http://schemas.microsoft.com/office/word/2012/wordml" xmlns:w16cex="http://schemas.microsoft.com/office/word/2018/wordml/cex" xmlns:w16cid="http://schemas.microsoft.com/office/word/2016/wordml/cid" xmlns:w16="http://schemas.microsoft.com/office/word/2018/wordml" xmlns:w16du="http://schemas.microsoft.com/office/word/2023/wordml/word16du" xmlns:w16sdtdh="http://schemas.microsoft.com/office/word/2020/wordml/sdtdatahash" xmlns:w16sdtfl="http://schemas.microsoft.com/office/word/2024/wordml/sdtformatlock" xmlns:w16se="http://schemas.microsoft.com/office/word/2015/wordml/symex" xmlns:wpg="http://schemas.microsoft.com/office/word/2010/wordprocessingGroup" xmlns:wpi="http://schemas.microsoft.com/office/word/2010/wordprocessingInk" xmlns:wne="http://schemas.microsoft.com/office/word/2006/wordml" xmlns:wps="http://schemas.microsoft.com/office/word/2010/wordprocessingShape" mc:Ignorable="w14 w15 w16se w16cid w16 w16cex w16sdtdh w16sdtfl w16du wp14">
   <w:footnote w:type="separator" w:id="-1">
     <w:p>
       <w:pPr>
@@ -9057,7 +9058,7 @@
 </file>
 
 <file path=word/numbering.xml><?xml version="1.0" encoding="utf-8"?>
-<w:numbering xmlns:wpc="http://schemas.microsoft.com/office/word/2010/wordprocessingCanvas" xmlns:cx="http://schemas.microsoft.com/office/drawing/2014/chartex" xmlns:cx1="http://schemas.microsoft.com/office/drawing/2015/9/8/chartex" xmlns:cx2="http://schemas.microsoft.com/office/drawing/2015/10/21/chartex" xmlns:cx3="http://schemas.microsoft.com/office/drawing/2016/5/9/chartex" xmlns:cx4="http://schemas.microsoft.com/office/drawing/2016/5/10/chartex" xmlns:cx5="http://schemas.microsoft.com/office/drawing/2016/5/11/chartex" xmlns:cx6="http://schemas.microsoft.com/office/drawing/2016/5/12/chartex" xmlns:cx7="http://schemas.microsoft.com/office/drawing/2016/5/13/chartex" xmlns:cx8="http://schemas.microsoft.com/office/drawing/2016/5/14/chartex" xmlns:mc="http://schemas.openxmlformats.org/markup-compatibility/2006" xmlns:aink="http://schemas.microsoft.com/office/drawing/2016/ink" xmlns:am3d="http://schemas.microsoft.com/office/drawing/2017/model3d" xmlns:o="urn:schemas-microsoft-com:office:office" xmlns:oel="http://schemas.microsoft.com/office/2019/extlst" xmlns:r="http://schemas.openxmlformats.org/officeDocument/2006/relationships" xmlns:m="http://schemas.openxmlformats.org/officeDocument/2006/math" xmlns:v="urn:schemas-microsoft-com:vml" xmlns:wp14="http://schemas.microsoft.com/office/word/2010/wordprocessingDrawing" xmlns:wp="http://schemas.openxmlformats.org/drawingml/2006/wordprocessingDrawing" xmlns:w10="urn:schemas-microsoft-com:office:word" xmlns:w="http://schemas.openxmlformats.org/wordprocessingml/2006/main" xmlns:w14="http://schemas.microsoft.com/office/word/2010/wordml" xmlns:w15="http://schemas.microsoft.com/office/word/2012/wordml" xmlns:w16cex="http://schemas.microsoft.com/office/word/2018/wordml/cex" xmlns:w16cid="http://schemas.microsoft.com/office/word/2016/wordml/cid" xmlns:w16="http://schemas.microsoft.com/office/word/2018/wordml" xmlns:w16sdtdh="http://schemas.microsoft.com/office/word/2020/wordml/sdtdatahash" xmlns:w16se="http://schemas.microsoft.com/office/word/2015/wordml/symex" xmlns:wpg="http://schemas.microsoft.com/office/word/2010/wordprocessingGroup" xmlns:wpi="http://schemas.microsoft.com/office/word/2010/wordprocessingInk" xmlns:wne="http://schemas.microsoft.com/office/word/2006/wordml" xmlns:wps="http://schemas.microsoft.com/office/word/2010/wordprocessingShape" mc:Ignorable="w14 w15 w16se w16cid w16 w16cex w16sdtdh wp14">
+<w:numbering xmlns:wpc="http://schemas.microsoft.com/office/word/2010/wordprocessingCanvas" xmlns:cx="http://schemas.microsoft.com/office/drawing/2014/chartex" xmlns:cx1="http://schemas.microsoft.com/office/drawing/2015/9/8/chartex" xmlns:cx2="http://schemas.microsoft.com/office/drawing/2015/10/21/chartex" xmlns:cx3="http://schemas.microsoft.com/office/drawing/2016/5/9/chartex" xmlns:cx4="http://schemas.microsoft.com/office/drawing/2016/5/10/chartex" xmlns:cx5="http://schemas.microsoft.com/office/drawing/2016/5/11/chartex" xmlns:cx6="http://schemas.microsoft.com/office/drawing/2016/5/12/chartex" xmlns:cx7="http://schemas.microsoft.com/office/drawing/2016/5/13/chartex" xmlns:cx8="http://schemas.microsoft.com/office/drawing/2016/5/14/chartex" xmlns:mc="http://schemas.openxmlformats.org/markup-compatibility/2006" xmlns:aink="http://schemas.microsoft.com/office/drawing/2016/ink" xmlns:am3d="http://schemas.microsoft.com/office/drawing/2017/model3d" xmlns:o="urn:schemas-microsoft-com:office:office" xmlns:oel="http://schemas.microsoft.com/office/2019/extlst" xmlns:r="http://schemas.openxmlformats.org/officeDocument/2006/relationships" xmlns:m="http://schemas.openxmlformats.org/officeDocument/2006/math" xmlns:v="urn:schemas-microsoft-com:vml" xmlns:wp14="http://schemas.microsoft.com/office/word/2010/wordprocessingDrawing" xmlns:wp="http://schemas.openxmlformats.org/drawingml/2006/wordprocessingDrawing" xmlns:w10="urn:schemas-microsoft-com:office:word" xmlns:w="http://schemas.openxmlformats.org/wordprocessingml/2006/main" xmlns:w14="http://schemas.microsoft.com/office/word/2010/wordml" xmlns:w15="http://schemas.microsoft.com/office/word/2012/wordml" xmlns:w16cex="http://schemas.microsoft.com/office/word/2018/wordml/cex" xmlns:w16cid="http://schemas.microsoft.com/office/word/2016/wordml/cid" xmlns:w16="http://schemas.microsoft.com/office/word/2018/wordml" xmlns:w16du="http://schemas.microsoft.com/office/word/2023/wordml/word16du" xmlns:w16sdtdh="http://schemas.microsoft.com/office/word/2020/wordml/sdtdatahash" xmlns:w16sdtfl="http://schemas.microsoft.com/office/word/2024/wordml/sdtformatlock" xmlns:w16se="http://schemas.microsoft.com/office/word/2015/wordml/symex" xmlns:wpg="http://schemas.microsoft.com/office/word/2010/wordprocessingGroup" xmlns:wpi="http://schemas.microsoft.com/office/word/2010/wordprocessingInk" xmlns:wne="http://schemas.microsoft.com/office/word/2006/wordml" xmlns:wps="http://schemas.microsoft.com/office/word/2010/wordprocessingShape" mc:Ignorable="w14 w15 w16se w16cid w16 w16cex w16sdtdh w16sdtfl w16du wp14">
   <w:abstractNum w:abstractNumId="0" w15:restartNumberingAfterBreak="0">
     <w:nsid w:val="083B6BFC"/>
     <w:multiLevelType w:val="hybridMultilevel"/>
@@ -11577,7 +11578,7 @@
 </file>
 
 <file path=word/styles.xml><?xml version="1.0" encoding="utf-8"?>
-<w:styles xmlns:mc="http://schemas.openxmlformats.org/markup-compatibility/2006" xmlns:r="http://schemas.openxmlformats.org/officeDocument/2006/relationships" xmlns:w="http://schemas.openxmlformats.org/wordprocessingml/2006/main" xmlns:w14="http://schemas.microsoft.com/office/word/2010/wordml" xmlns:w15="http://schemas.microsoft.com/office/word/2012/wordml" xmlns:w16cex="http://schemas.microsoft.com/office/word/2018/wordml/cex" xmlns:w16cid="http://schemas.microsoft.com/office/word/2016/wordml/cid" xmlns:w16="http://schemas.microsoft.com/office/word/2018/wordml" xmlns:w16sdtdh="http://schemas.microsoft.com/office/word/2020/wordml/sdtdatahash" xmlns:w16se="http://schemas.microsoft.com/office/word/2015/wordml/symex" mc:Ignorable="w14 w15 w16se w16cid w16 w16cex w16sdtdh">
+<w:styles xmlns:mc="http://schemas.openxmlformats.org/markup-compatibility/2006" xmlns:r="http://schemas.openxmlformats.org/officeDocument/2006/relationships" xmlns:w="http://schemas.openxmlformats.org/wordprocessingml/2006/main" xmlns:w14="http://schemas.microsoft.com/office/word/2010/wordml" xmlns:w15="http://schemas.microsoft.com/office/word/2012/wordml" xmlns:w16cex="http://schemas.microsoft.com/office/word/2018/wordml/cex" xmlns:w16cid="http://schemas.microsoft.com/office/word/2016/wordml/cid" xmlns:w16="http://schemas.microsoft.com/office/word/2018/wordml" xmlns:w16du="http://schemas.microsoft.com/office/word/2023/wordml/word16du" xmlns:w16sdtdh="http://schemas.microsoft.com/office/word/2020/wordml/sdtdatahash" xmlns:w16sdtfl="http://schemas.microsoft.com/office/word/2024/wordml/sdtformatlock" xmlns:w16se="http://schemas.microsoft.com/office/word/2015/wordml/symex" mc:Ignorable="w14 w15 w16se w16cid w16 w16cex w16sdtdh w16sdtfl w16du">
   <w:docDefaults>
     <w:rPrDefault>
       <w:rPr>

</xml_diff>